<commit_message>
Report v1.2: all four detectors, saneamento + L1 partial
</commit_message>
<xml_diff>
--- a/docs/relatorio-tecnico.docx
+++ b/docs/relatorio-tecnico.docx
@@ -1250,13 +1250,19 @@
         <w:br/>
       </w:r>
       <w:r>
-        <w:t xml:space="preserve">    7.2 Detector 3 — suspeita de sobrepreço</w:t>
+        <w:t xml:space="preserve">    7.2 Detector 2 — alocação abaixo do esperado</w:t>
       </w:r>
       <w:r>
         <w:br/>
       </w:r>
       <w:r>
-        <w:t xml:space="preserve">    7.3 Detector 4 — suspeita de desabastecimento</w:t>
+        <w:t xml:space="preserve">    7.3 Detector 3 — suspeita de sobrepreço</w:t>
+      </w:r>
+      <w:r>
+        <w:br/>
+      </w:r>
+      <w:r>
+        <w:t xml:space="preserve">    7.4 Detector 4 — suspeita de desabastecimento</w:t>
       </w:r>
       <w:r>
         <w:br/>
@@ -1842,31 +1848,31 @@
               <w:jc w:val="left"/>
             </w:pPr>
             <w:r>
-              <w:t xml:space="preserve">CadÚnico — MI Social / SAGI-MDS</w:t>
-            </w:r>
-          </w:p>
-        </w:tc>
-        <w:tc>
-          <w:tcPr/>
-          <w:p>
-            <w:pPr>
-              <w:pStyle w:val="Compact"/>
-              <w:jc w:val="left"/>
-            </w:pPr>
-            <w:r>
-              <w:t xml:space="preserve">eixo N · subíndice de vulnerabilidade</w:t>
-            </w:r>
-          </w:p>
-        </w:tc>
-        <w:tc>
-          <w:tcPr/>
-          <w:p>
-            <w:pPr>
-              <w:pStyle w:val="Compact"/>
-              <w:jc w:val="left"/>
-            </w:pPr>
-            <w:r>
-              <w:t xml:space="preserve">✅ ingerido (índice Solr, 185/185, 2020–2024)</w:t>
+              <w:t xml:space="preserve">IBGE — Censo 2022 (agregados 6803/6805/6892)</w:t>
+            </w:r>
+          </w:p>
+        </w:tc>
+        <w:tc>
+          <w:tcPr/>
+          <w:p>
+            <w:pPr>
+              <w:pStyle w:val="Compact"/>
+              <w:jc w:val="left"/>
+            </w:pPr>
+            <w:r>
+              <w:t xml:space="preserve">eixo N · subíndice de saneamento</w:t>
+            </w:r>
+          </w:p>
+        </w:tc>
+        <w:tc>
+          <w:tcPr/>
+          <w:p>
+            <w:pPr>
+              <w:pStyle w:val="Compact"/>
+              <w:jc w:val="left"/>
+            </w:pPr>
+            <w:r>
+              <w:t xml:space="preserve">✅ ingerido (déficit de água/esgoto/lixo, 185/185)</w:t>
             </w:r>
           </w:p>
         </w:tc>
@@ -1880,31 +1886,31 @@
               <w:jc w:val="left"/>
             </w:pPr>
             <w:r>
-              <w:t xml:space="preserve">PNCP — Portal Nacional de Contratações Públicas</w:t>
-            </w:r>
-          </w:p>
-        </w:tc>
-        <w:tc>
-          <w:tcPr/>
-          <w:p>
-            <w:pPr>
-              <w:pStyle w:val="Compact"/>
-              <w:jc w:val="left"/>
-            </w:pPr>
-            <w:r>
-              <w:t xml:space="preserve">eixo A · camada L3 (compras municipais)</w:t>
-            </w:r>
-          </w:p>
-        </w:tc>
-        <w:tc>
-          <w:tcPr/>
-          <w:p>
-            <w:pPr>
-              <w:pStyle w:val="Compact"/>
-              <w:jc w:val="left"/>
-            </w:pPr>
-            <w:r>
-              <w:t xml:space="preserve">✅ ingerido (172/185; itens com preço unitário para ~880 contratos de saúde)</w:t>
+              <w:t xml:space="preserve">CadÚnico — MI Social / SAGI-MDS</w:t>
+            </w:r>
+          </w:p>
+        </w:tc>
+        <w:tc>
+          <w:tcPr/>
+          <w:p>
+            <w:pPr>
+              <w:pStyle w:val="Compact"/>
+              <w:jc w:val="left"/>
+            </w:pPr>
+            <w:r>
+              <w:t xml:space="preserve">eixo N · subíndice de vulnerabilidade</w:t>
+            </w:r>
+          </w:p>
+        </w:tc>
+        <w:tc>
+          <w:tcPr/>
+          <w:p>
+            <w:pPr>
+              <w:pStyle w:val="Compact"/>
+              <w:jc w:val="left"/>
+            </w:pPr>
+            <w:r>
+              <w:t xml:space="preserve">✅ ingerido (índice Solr, 185/185, 2020–2024)</w:t>
             </w:r>
           </w:p>
         </w:tc>
@@ -1918,31 +1924,31 @@
               <w:jc w:val="left"/>
             </w:pPr>
             <w:r>
-              <w:t xml:space="preserve">SIOPS</w:t>
-            </w:r>
-          </w:p>
-        </w:tc>
-        <w:tc>
-          <w:tcPr/>
-          <w:p>
-            <w:pPr>
-              <w:pStyle w:val="Compact"/>
-              <w:jc w:val="left"/>
-            </w:pPr>
-            <w:r>
-              <w:t xml:space="preserve">eixo A · camada L2 (execução própria municipal)</w:t>
-            </w:r>
-          </w:p>
-        </w:tc>
-        <w:tc>
-          <w:tcPr/>
-          <w:p>
-            <w:pPr>
-              <w:pStyle w:val="Compact"/>
-              <w:jc w:val="left"/>
-            </w:pPr>
-            <w:r>
-              <w:t xml:space="preserve">✅ ingerido (TabNet legado por POST; 184/185, 2020–2024)</w:t>
+              <w:t xml:space="preserve">PNCP — Portal Nacional de Contratações Públicas</w:t>
+            </w:r>
+          </w:p>
+        </w:tc>
+        <w:tc>
+          <w:tcPr/>
+          <w:p>
+            <w:pPr>
+              <w:pStyle w:val="Compact"/>
+              <w:jc w:val="left"/>
+            </w:pPr>
+            <w:r>
+              <w:t xml:space="preserve">eixo A · camada L3 (compras municipais)</w:t>
+            </w:r>
+          </w:p>
+        </w:tc>
+        <w:tc>
+          <w:tcPr/>
+          <w:p>
+            <w:pPr>
+              <w:pStyle w:val="Compact"/>
+              <w:jc w:val="left"/>
+            </w:pPr>
+            <w:r>
+              <w:t xml:space="preserve">✅ ingerido (172/185; itens com preço unitário para 801 contratos de saúde)</w:t>
             </w:r>
           </w:p>
         </w:tc>
@@ -1956,31 +1962,31 @@
               <w:jc w:val="left"/>
             </w:pPr>
             <w:r>
-              <w:t xml:space="preserve">Compras.gov.br / SIASG</w:t>
-            </w:r>
-          </w:p>
-        </w:tc>
-        <w:tc>
-          <w:tcPr/>
-          <w:p>
-            <w:pPr>
-              <w:pStyle w:val="Compact"/>
-              <w:jc w:val="left"/>
-            </w:pPr>
-            <w:r>
-              <w:t xml:space="preserve">eixo A · L3 federal (complemento)</w:t>
-            </w:r>
-          </w:p>
-        </w:tc>
-        <w:tc>
-          <w:tcPr/>
-          <w:p>
-            <w:pPr>
-              <w:pStyle w:val="Compact"/>
-              <w:jc w:val="left"/>
-            </w:pPr>
-            <w:r>
-              <w:t xml:space="preserve">⏳ endpoint validado, módulo não escrito</w:t>
+              <w:t xml:space="preserve">SIOPS</w:t>
+            </w:r>
+          </w:p>
+        </w:tc>
+        <w:tc>
+          <w:tcPr/>
+          <w:p>
+            <w:pPr>
+              <w:pStyle w:val="Compact"/>
+              <w:jc w:val="left"/>
+            </w:pPr>
+            <w:r>
+              <w:t xml:space="preserve">eixo A · camada L2 (execução própria municipal)</w:t>
+            </w:r>
+          </w:p>
+        </w:tc>
+        <w:tc>
+          <w:tcPr/>
+          <w:p>
+            <w:pPr>
+              <w:pStyle w:val="Compact"/>
+              <w:jc w:val="left"/>
+            </w:pPr>
+            <w:r>
+              <w:t xml:space="preserve">✅ ingerido (TabNet legado por POST; 184/185, 2020–2024)</w:t>
             </w:r>
           </w:p>
         </w:tc>
@@ -1994,44 +2000,6 @@
               <w:jc w:val="left"/>
             </w:pPr>
             <w:r>
-              <w:t xml:space="preserve">SNIS</w:t>
-            </w:r>
-          </w:p>
-        </w:tc>
-        <w:tc>
-          <w:tcPr/>
-          <w:p>
-            <w:pPr>
-              <w:pStyle w:val="Compact"/>
-              <w:jc w:val="left"/>
-            </w:pPr>
-            <w:r>
-              <w:t xml:space="preserve">eixo N · subíndice de saneamento</w:t>
-            </w:r>
-          </w:p>
-        </w:tc>
-        <w:tc>
-          <w:tcPr/>
-          <w:p>
-            <w:pPr>
-              <w:pStyle w:val="Compact"/>
-              <w:jc w:val="left"/>
-            </w:pPr>
-            <w:r>
-              <w:t xml:space="preserve">🔴 sistema encerrado em 2023 (sucessor: SINISA); domínio da série histórica não resolve. Substituir pelo Censo 2022 do IBGE</w:t>
-            </w:r>
-          </w:p>
-        </w:tc>
-      </w:tr>
-      <w:tr>
-        <w:tc>
-          <w:tcPr/>
-          <w:p>
-            <w:pPr>
-              <w:pStyle w:val="Compact"/>
-              <w:jc w:val="left"/>
-            </w:pPr>
-            <w:r>
               <w:t xml:space="preserve">Portal da Transparência (CGU)</w:t>
             </w:r>
           </w:p>
@@ -2056,7 +2024,20 @@
               <w:jc w:val="left"/>
             </w:pPr>
             <w:r>
-              <w:t xml:space="preserve">🔴 endpoint</w:t>
+              <w:t xml:space="preserve">🔶</w:t>
+            </w:r>
+            <w:r>
+              <w:t xml:space="preserve"> </w:t>
+            </w:r>
+            <w:r>
+              <w:rPr>
+                <w:bCs/>
+                <w:b/>
+              </w:rPr>
+              <w:t xml:space="preserve">L1 parcial</w:t>
+            </w:r>
+            <w:r>
+              <w:t xml:space="preserve">:</w:t>
             </w:r>
             <w:r>
               <w:t xml:space="preserve"> </w:t>
@@ -2071,7 +2052,83 @@
               <w:t xml:space="preserve"> </w:t>
             </w:r>
             <w:r>
-              <w:t xml:space="preserve">retorna HTTP 403 (exige nível de acesso gov.br elevado)</w:t>
+              <w:t xml:space="preserve">dá HTTP 403; as transferências sociais por município respondem, mas a chave gratuita é bloqueada por volume (42/185 coletados; retomável)</w:t>
+            </w:r>
+          </w:p>
+        </w:tc>
+      </w:tr>
+      <w:tr>
+        <w:tc>
+          <w:tcPr/>
+          <w:p>
+            <w:pPr>
+              <w:pStyle w:val="Compact"/>
+              <w:jc w:val="left"/>
+            </w:pPr>
+            <w:r>
+              <w:t xml:space="preserve">Compras.gov.br / SIASG</w:t>
+            </w:r>
+          </w:p>
+        </w:tc>
+        <w:tc>
+          <w:tcPr/>
+          <w:p>
+            <w:pPr>
+              <w:pStyle w:val="Compact"/>
+              <w:jc w:val="left"/>
+            </w:pPr>
+            <w:r>
+              <w:t xml:space="preserve">eixo A · L3 federal (complemento)</w:t>
+            </w:r>
+          </w:p>
+        </w:tc>
+        <w:tc>
+          <w:tcPr/>
+          <w:p>
+            <w:pPr>
+              <w:pStyle w:val="Compact"/>
+              <w:jc w:val="left"/>
+            </w:pPr>
+            <w:r>
+              <w:t xml:space="preserve">⏳ endpoint validado, módulo não escrito</w:t>
+            </w:r>
+          </w:p>
+        </w:tc>
+      </w:tr>
+      <w:tr>
+        <w:tc>
+          <w:tcPr/>
+          <w:p>
+            <w:pPr>
+              <w:pStyle w:val="Compact"/>
+              <w:jc w:val="left"/>
+            </w:pPr>
+            <w:r>
+              <w:t xml:space="preserve">SNIS</w:t>
+            </w:r>
+          </w:p>
+        </w:tc>
+        <w:tc>
+          <w:tcPr/>
+          <w:p>
+            <w:pPr>
+              <w:pStyle w:val="Compact"/>
+              <w:jc w:val="left"/>
+            </w:pPr>
+            <w:r>
+              <w:t xml:space="preserve">eixo N · subíndice de saneamento</w:t>
+            </w:r>
+          </w:p>
+        </w:tc>
+        <w:tc>
+          <w:tcPr/>
+          <w:p>
+            <w:pPr>
+              <w:pStyle w:val="Compact"/>
+              <w:jc w:val="left"/>
+            </w:pPr>
+            <w:r>
+              <w:t xml:space="preserve">🔴 encerrado (2023) — substituído pelo Censo 2022 do IBGE (linha acima)</w:t>
             </w:r>
           </w:p>
         </w:tc>
@@ -3821,29 +3878,25 @@
           <w:bCs/>
           <w:b/>
         </w:rPr>
-        <w:t xml:space="preserve">Alocação L3</w:t>
-      </w:r>
-      <w:r>
-        <w:t xml:space="preserve"> </w:t>
-      </w:r>
-      <w:r>
-        <w:t xml:space="preserve">(PNCP) e</w:t>
-      </w:r>
-      <w:r>
-        <w:t xml:space="preserve"> </w:t>
-      </w:r>
-      <w:r>
-        <w:rPr>
-          <w:bCs/>
-          <w:b/>
-        </w:rPr>
-        <w:t xml:space="preserve">L2</w:t>
-      </w:r>
-      <w:r>
-        <w:t xml:space="preserve"> </w:t>
-      </w:r>
-      <w:r>
-        <w:t xml:space="preserve">(SIOPS) →</w:t>
+        <w:t xml:space="preserve">Alocação</w:t>
+      </w:r>
+      <w:r>
+        <w:t xml:space="preserve"> </w:t>
+      </w:r>
+      <w:r>
+        <w:t xml:space="preserve">— L2 (SIOPS), L3 (PNCP) e L1 (Transparência, parcial) →</w:t>
+      </w:r>
+      <w:r>
+        <w:t xml:space="preserve"> </w:t>
+      </w:r>
+      <w:r>
+        <w:rPr>
+          <w:rStyle w:val="VerbatimChar"/>
+        </w:rPr>
+        <w:t xml:space="preserve">l2_per_capita</w:t>
+      </w:r>
+      <w:r>
+        <w:t xml:space="preserve">,</w:t>
       </w:r>
       <w:r>
         <w:t xml:space="preserve"> </w:t>
@@ -3855,62 +3908,55 @@
         <w:t xml:space="preserve">l3_per_capita</w:t>
       </w:r>
       <w:r>
-        <w:t xml:space="preserve"> </w:t>
-      </w:r>
-      <w:r>
-        <w:t xml:space="preserve">e</w:t>
-      </w:r>
-      <w:r>
-        <w:t xml:space="preserve"> </w:t>
-      </w:r>
-      <w:r>
-        <w:rPr>
-          <w:rStyle w:val="VerbatimChar"/>
-        </w:rPr>
-        <w:t xml:space="preserve">l2_per_capita</w:t>
-      </w:r>
-      <w:r>
         <w:t xml:space="preserve">,</w:t>
       </w:r>
       <w:r>
         <w:t xml:space="preserve"> </w:t>
       </w:r>
       <w:r>
-        <w:t xml:space="preserve">ambos</w:t>
-      </w:r>
-      <w:r>
-        <w:t xml:space="preserve"> </w:t>
-      </w:r>
-      <w:r>
-        <w:rPr>
-          <w:bCs/>
-          <w:b/>
-        </w:rPr>
-        <w:t xml:space="preserve">deflacionados para 2024</w:t>
-      </w:r>
-      <w:r>
-        <w:t xml:space="preserve"> </w:t>
-      </w:r>
-      <w:r>
-        <w:t xml:space="preserve">pela média anual do IPCA. A camada L1</w:t>
-      </w:r>
-      <w:r>
-        <w:t xml:space="preserve"> </w:t>
-      </w:r>
-      <w:r>
-        <w:t xml:space="preserve">(Portal da Transparência) entra como</w:t>
-      </w:r>
-      <w:r>
-        <w:t xml:space="preserve"> </w:t>
-      </w:r>
-      <w:r>
-        <w:rPr>
-          <w:rStyle w:val="VerbatimChar"/>
-        </w:rPr>
-        <w:t xml:space="preserve">NULL</w:t>
-      </w:r>
-      <w:r>
-        <w:t xml:space="preserve">.</w:t>
+        <w:rPr>
+          <w:rStyle w:val="VerbatimChar"/>
+        </w:rPr>
+        <w:t xml:space="preserve">l1_per_capita</w:t>
+      </w:r>
+      <w:r>
+        <w:t xml:space="preserve">, todos</w:t>
+      </w:r>
+      <w:r>
+        <w:t xml:space="preserve"> </w:t>
+      </w:r>
+      <w:r>
+        <w:rPr>
+          <w:bCs/>
+          <w:b/>
+        </w:rPr>
+        <w:t xml:space="preserve">deflacionados</w:t>
+      </w:r>
+      <w:r>
+        <w:rPr>
+          <w:bCs/>
+          <w:b/>
+        </w:rPr>
+        <w:t xml:space="preserve"> </w:t>
+      </w:r>
+      <w:r>
+        <w:rPr>
+          <w:bCs/>
+          <w:b/>
+        </w:rPr>
+        <w:t xml:space="preserve">para 2024</w:t>
+      </w:r>
+      <w:r>
+        <w:t xml:space="preserve"> </w:t>
+      </w:r>
+      <w:r>
+        <w:t xml:space="preserve">pela média anual do IPCA (o L1 é o valor mensal de junho</w:t>
+      </w:r>
+      <w:r>
+        <w:t xml:space="preserve"> </w:t>
+      </w:r>
+      <w:r>
+        <w:t xml:space="preserve">anualizado × 12).</w:t>
       </w:r>
     </w:p>
     <w:p>
@@ -3954,6 +4000,67 @@
       </w:r>
       <w:r>
         <w:t xml:space="preserve">extrema pobreza / população × 1000.</w:t>
+      </w:r>
+    </w:p>
+    <w:p>
+      <w:pPr>
+        <w:numPr>
+          <w:ilvl w:val="0"/>
+          <w:numId w:val="1005"/>
+        </w:numPr>
+        <w:pStyle w:val="Compact"/>
+      </w:pPr>
+      <w:r>
+        <w:rPr>
+          <w:bCs/>
+          <w:b/>
+        </w:rPr>
+        <w:t xml:space="preserve">Saneamento</w:t>
+      </w:r>
+      <w:r>
+        <w:t xml:space="preserve"> </w:t>
+      </w:r>
+      <w:r>
+        <w:t xml:space="preserve">(Censo 2022) →</w:t>
+      </w:r>
+      <w:r>
+        <w:t xml:space="preserve"> </w:t>
+      </w:r>
+      <w:r>
+        <w:rPr>
+          <w:rStyle w:val="VerbatimChar"/>
+        </w:rPr>
+        <w:t xml:space="preserve">sub_saneamento_bruto</w:t>
+      </w:r>
+      <w:r>
+        <w:t xml:space="preserve"> </w:t>
+      </w:r>
+      <w:r>
+        <w:t xml:space="preserve">= déficit ponderado de</w:t>
+      </w:r>
+      <w:r>
+        <w:t xml:space="preserve"> </w:t>
+      </w:r>
+      <w:r>
+        <w:t xml:space="preserve">água/esgoto/lixo (pesos de</w:t>
+      </w:r>
+      <w:r>
+        <w:t xml:space="preserve"> </w:t>
+      </w:r>
+      <w:r>
+        <w:rPr>
+          <w:rStyle w:val="VerbatimChar"/>
+        </w:rPr>
+        <w:t xml:space="preserve">conf/ieas.yml</w:t>
+      </w:r>
+      <w:r>
+        <w:t xml:space="preserve">), um retrato de 2022 aplicado a</w:t>
+      </w:r>
+      <w:r>
+        <w:t xml:space="preserve"> </w:t>
+      </w:r>
+      <w:r>
+        <w:t xml:space="preserve">todo o recorte.</w:t>
       </w:r>
     </w:p>
     <w:p>
@@ -4279,7 +4386,7 @@
               <w:jc w:val="left"/>
             </w:pPr>
             <w:r>
-              <w:t xml:space="preserve">Saneamento (déficit = 1 − cobertura)</w:t>
+              <w:t xml:space="preserve">Saneamento (déficit de água + esgoto + lixo)</w:t>
             </w:r>
           </w:p>
         </w:tc>
@@ -4303,19 +4410,19 @@
               <w:jc w:val="left"/>
             </w:pPr>
             <w:r>
-              <w:t xml:space="preserve">SNIS</w:t>
-            </w:r>
-          </w:p>
-        </w:tc>
-        <w:tc>
-          <w:tcPr/>
-          <w:p>
-            <w:pPr>
-              <w:pStyle w:val="Compact"/>
-              <w:jc w:val="left"/>
-            </w:pPr>
-            <w:r>
-              <w:t xml:space="preserve">🔴 (substituir por Censo 2022 IBGE)</w:t>
+              <w:t xml:space="preserve">Censo 2022 do IBGE</w:t>
+            </w:r>
+          </w:p>
+        </w:tc>
+        <w:tc>
+          <w:tcPr/>
+          <w:p>
+            <w:pPr>
+              <w:pStyle w:val="Compact"/>
+              <w:jc w:val="left"/>
+            </w:pPr>
+            <w:r>
+              <w:t xml:space="preserve">✅</w:t>
             </w:r>
           </w:p>
         </w:tc>
@@ -4558,7 +4665,7 @@
               <w:jc w:val="left"/>
             </w:pPr>
             <w:r>
-              <w:t xml:space="preserve">🔴 HTTP 403</w:t>
+              <w:t xml:space="preserve">🔶 parcial (42/185)</w:t>
             </w:r>
           </w:p>
         </w:tc>
@@ -5111,97 +5218,113 @@
         <w:pStyle w:val="BodyText"/>
       </w:pPr>
       <w:r>
-        <w:t xml:space="preserve">Hoje: Necessidade tem</w:t>
-      </w:r>
-      <w:r>
-        <w:t xml:space="preserve"> </w:t>
-      </w:r>
-      <w:r>
-        <w:rPr>
-          <w:bCs/>
-          <w:b/>
-        </w:rPr>
-        <w:t xml:space="preserve">2 de 3</w:t>
-      </w:r>
-      <w:r>
-        <w:t xml:space="preserve"> </w:t>
-      </w:r>
-      <w:r>
-        <w:t xml:space="preserve">subíndices (epidemiológico + vulnerabilidade,</w:t>
-      </w:r>
-      <w:r>
-        <w:t xml:space="preserve"> </w:t>
-      </w:r>
-      <w:r>
-        <w:t xml:space="preserve">67%) e Alocação tem</w:t>
-      </w:r>
-      <w:r>
-        <w:t xml:space="preserve"> </w:t>
-      </w:r>
-      <w:r>
-        <w:rPr>
-          <w:bCs/>
-          <w:b/>
-        </w:rPr>
-        <w:t xml:space="preserve">2 de 3</w:t>
-      </w:r>
-      <w:r>
-        <w:t xml:space="preserve"> </w:t>
-      </w:r>
-      <w:r>
-        <w:t xml:space="preserve">camadas (L2 + L3, 67% — mas só onde há PNCP no</w:t>
-      </w:r>
-      <w:r>
-        <w:t xml:space="preserve"> </w:t>
-      </w:r>
-      <w:r>
-        <w:t xml:space="preserve">ano). Os dois eixos passam o limiar para</w:t>
-      </w:r>
-      <w:r>
-        <w:t xml:space="preserve"> </w:t>
-      </w:r>
-      <w:r>
-        <w:rPr>
-          <w:bCs/>
-          <w:b/>
-        </w:rPr>
-        <w:t xml:space="preserve">335 dos 925 município-anos</w:t>
-      </w:r>
-      <w:r>
-        <w:t xml:space="preserve"> </w:t>
-      </w:r>
-      <w:r>
-        <w:t xml:space="preserve">(156 dos</w:t>
-      </w:r>
-      <w:r>
-        <w:t xml:space="preserve"> </w:t>
-      </w:r>
-      <w:r>
-        <w:t xml:space="preserve">185 municípios em 2024). Os 590 município-anos cinza são, na maioria, os que não</w:t>
-      </w:r>
-      <w:r>
-        <w:t xml:space="preserve"> </w:t>
-      </w:r>
-      <w:r>
-        <w:t xml:space="preserve">têm contratação publicada no PNCP naquele ano — a cobertura da camada L3 sobe de</w:t>
-      </w:r>
-      <w:r>
-        <w:t xml:space="preserve"> </w:t>
-      </w:r>
-      <w:r>
-        <w:t xml:space="preserve">6 municípios em 2021 para 157 em 2024, então 2020–2021 saem quase inteiros cinza.</w:t>
-      </w:r>
-      <w:r>
-        <w:t xml:space="preserve"> </w:t>
-      </w:r>
-      <w:r>
-        <w:t xml:space="preserve">Ingerir a camada L1 (Portal da Transparência) fecharia o eixo Alocação em 3 de 3</w:t>
-      </w:r>
-      <w:r>
-        <w:t xml:space="preserve"> </w:t>
-      </w:r>
-      <w:r>
-        <w:t xml:space="preserve">e reduziria bastante o cinza.</w:t>
+        <w:t xml:space="preserve">Hoje a</w:t>
+      </w:r>
+      <w:r>
+        <w:t xml:space="preserve"> </w:t>
+      </w:r>
+      <w:r>
+        <w:rPr>
+          <w:bCs/>
+          <w:b/>
+        </w:rPr>
+        <w:t xml:space="preserve">Necessidade está completa (3 de 3 subíndices) para todos os 185</w:t>
+      </w:r>
+      <w:r>
+        <w:rPr>
+          <w:bCs/>
+          <w:b/>
+        </w:rPr>
+        <w:t xml:space="preserve"> </w:t>
+      </w:r>
+      <w:r>
+        <w:rPr>
+          <w:bCs/>
+          <w:b/>
+        </w:rPr>
+        <w:t xml:space="preserve">municípios</w:t>
+      </w:r>
+      <w:r>
+        <w:t xml:space="preserve"> </w:t>
+      </w:r>
+      <w:r>
+        <w:t xml:space="preserve">— o subíndice de saneamento entrou via Censo 2022. A</w:t>
+      </w:r>
+      <w:r>
+        <w:t xml:space="preserve"> </w:t>
+      </w:r>
+      <w:r>
+        <w:rPr>
+          <w:bCs/>
+          <w:b/>
+        </w:rPr>
+        <w:t xml:space="preserve">Alocação</w:t>
+      </w:r>
+      <w:r>
+        <w:t xml:space="preserve"> </w:t>
+      </w:r>
+      <w:r>
+        <w:t xml:space="preserve">tem L2 e L3 para quase todos e L1 para 42 municípios (a chave do Portal da</w:t>
+      </w:r>
+      <w:r>
+        <w:t xml:space="preserve"> </w:t>
+      </w:r>
+      <w:r>
+        <w:t xml:space="preserve">Transparência foi bloqueada por volume). O IEAS é calculado para</w:t>
+      </w:r>
+      <w:r>
+        <w:t xml:space="preserve"> </w:t>
+      </w:r>
+      <w:r>
+        <w:rPr>
+          <w:bCs/>
+          <w:b/>
+        </w:rPr>
+        <w:t xml:space="preserve">468 dos 925</w:t>
+      </w:r>
+      <w:r>
+        <w:rPr>
+          <w:bCs/>
+          <w:b/>
+        </w:rPr>
+        <w:t xml:space="preserve"> </w:t>
+      </w:r>
+      <w:r>
+        <w:rPr>
+          <w:bCs/>
+          <w:b/>
+        </w:rPr>
+        <w:t xml:space="preserve">município-anos</w:t>
+      </w:r>
+      <w:r>
+        <w:t xml:space="preserve"> </w:t>
+      </w:r>
+      <w:r>
+        <w:t xml:space="preserve">(156 dos 185 municípios em 2024). Os cinza restantes são, na</w:t>
+      </w:r>
+      <w:r>
+        <w:t xml:space="preserve"> </w:t>
+      </w:r>
+      <w:r>
+        <w:t xml:space="preserve">maioria, município-anos sem contratação no PNCP naquele ano — a cobertura de L3</w:t>
+      </w:r>
+      <w:r>
+        <w:t xml:space="preserve"> </w:t>
+      </w:r>
+      <w:r>
+        <w:t xml:space="preserve">sobe de 6 municípios em 2021 para 157 em 2024, então 2020–2021 saem quase</w:t>
+      </w:r>
+      <w:r>
+        <w:t xml:space="preserve"> </w:t>
+      </w:r>
+      <w:r>
+        <w:t xml:space="preserve">inteiros cinza. Completar a coleta de L1 leva o eixo Alocação a 3 de 3 para o</w:t>
+      </w:r>
+      <w:r>
+        <w:t xml:space="preserve"> </w:t>
+      </w:r>
+      <w:r>
+        <w:t xml:space="preserve">resto do estado.</w:t>
       </w:r>
     </w:p>
     <w:p>
@@ -6101,7 +6224,7 @@
     </w:p>
     <w:bookmarkEnd w:id="37"/>
     <w:bookmarkEnd w:id="38"/>
-    <w:bookmarkStart w:id="42" w:name="detectores-de-anomalia"/>
+    <w:bookmarkStart w:id="43" w:name="detectores-de-anomalia"/>
     <w:p>
       <w:pPr>
         <w:pStyle w:val="Heading1"/>
@@ -6115,20 +6238,23 @@
         <w:pStyle w:val="FirstParagraph"/>
       </w:pPr>
       <w:r>
-        <w:t xml:space="preserve">Do plano de quatro detectores,</w:t>
-      </w:r>
-      <w:r>
-        <w:t xml:space="preserve"> </w:t>
-      </w:r>
-      <w:r>
-        <w:rPr>
-          <w:bCs/>
-          <w:b/>
-        </w:rPr>
-        <w:t xml:space="preserve">três estão ativos</w:t>
-      </w:r>
-      <w:r>
-        <w:t xml:space="preserve">. Cada alerta traz uma</w:t>
+        <w:t xml:space="preserve">Os</w:t>
+      </w:r>
+      <w:r>
+        <w:t xml:space="preserve"> </w:t>
+      </w:r>
+      <w:r>
+        <w:rPr>
+          <w:bCs/>
+          <w:b/>
+        </w:rPr>
+        <w:t xml:space="preserve">quatro detectores</w:t>
+      </w:r>
+      <w:r>
+        <w:t xml:space="preserve"> </w:t>
+      </w:r>
+      <w:r>
+        <w:t xml:space="preserve">do plano estão ativos. Cada alerta traz uma</w:t>
       </w:r>
       <w:r>
         <w:t xml:space="preserve"> </w:t>
@@ -6184,47 +6310,26 @@
         <w:t xml:space="preserve"> </w:t>
       </w:r>
       <w:r>
-        <w:t xml:space="preserve">necessidade não atendida. Depende do IEAS ter cor, portanto</w:t>
-      </w:r>
-      <w:r>
-        <w:t xml:space="preserve"> </w:t>
-      </w:r>
-      <w:r>
-        <w:rPr>
-          <w:bCs/>
-          <w:b/>
-        </w:rPr>
-        <w:t xml:space="preserve">não produz linhas</w:t>
-      </w:r>
-      <w:r>
-        <w:rPr>
-          <w:bCs/>
-          <w:b/>
-        </w:rPr>
-        <w:t xml:space="preserve"> </w:t>
-      </w:r>
-      <w:r>
-        <w:rPr>
-          <w:bCs/>
-          <w:b/>
-        </w:rPr>
-        <w:t xml:space="preserve">nesta versão</w:t>
-      </w:r>
-      <w:r>
-        <w:t xml:space="preserve"> </w:t>
-      </w:r>
-      <w:r>
-        <w:t xml:space="preserve">(tudo cinza).</w:t>
+        <w:t xml:space="preserve">necessidade não atendida. É um corte fixo (</w:t>
+      </w:r>
+      <w:r>
+        <w:rPr>
+          <w:rStyle w:val="VerbatimChar"/>
+        </w:rPr>
+        <w:t xml:space="preserve">gap ≤ −0,33</w:t>
+      </w:r>
+      <w:r>
+        <w:t xml:space="preserve">).</w:t>
       </w:r>
     </w:p>
     <w:bookmarkEnd w:id="39"/>
-    <w:bookmarkStart w:id="40" w:name="detector-3-suspeita-de-sobrepreço"/>
+    <w:bookmarkStart w:id="40" w:name="detector-2-alocação-abaixo-do-esperado"/>
     <w:p>
       <w:pPr>
         <w:pStyle w:val="Heading2"/>
       </w:pPr>
       <w:r>
-        <w:t xml:space="preserve">7.2 Detector 3 — suspeita de sobrepreço</w:t>
+        <w:t xml:space="preserve">7.2 Detector 2 — alocação abaixo do esperado</w:t>
       </w:r>
     </w:p>
     <w:p>
@@ -6232,317 +6337,55 @@
         <w:pStyle w:val="FirstParagraph"/>
       </w:pPr>
       <w:r>
-        <w:t xml:space="preserve">Preço unitário de um item de insumo acima de</w:t>
-      </w:r>
-      <w:r>
-        <w:t xml:space="preserve"> </w:t>
-      </w:r>
-      <w:r>
-        <w:rPr>
-          <w:bCs/>
-          <w:b/>
-        </w:rPr>
-        <w:t xml:space="preserve">Q3 + fator·IQR</w:t>
-      </w:r>
-      <w:r>
-        <w:t xml:space="preserve"> </w:t>
-      </w:r>
-      <w:r>
-        <w:t xml:space="preserve">da distribuição</w:t>
-      </w:r>
-      <w:r>
-        <w:t xml:space="preserve"> </w:t>
-      </w:r>
-      <w:r>
-        <w:t xml:space="preserve">da mesma categoria em PE (</w:t>
-      </w:r>
-      <w:r>
-        <w:rPr>
-          <w:rStyle w:val="VerbatimChar"/>
-        </w:rPr>
-        <w:t xml:space="preserve">fator</w:t>
-      </w:r>
-      <w:r>
-        <w:t xml:space="preserve"> </w:t>
-      </w:r>
-      <w:r>
-        <w:t xml:space="preserve">em</w:t>
-      </w:r>
-      <w:r>
-        <w:t xml:space="preserve"> </w:t>
-      </w:r>
-      <w:r>
-        <w:rPr>
-          <w:rStyle w:val="VerbatimChar"/>
-        </w:rPr>
-        <w:t xml:space="preserve">conf/ieas.yml</w:t>
-      </w:r>
-      <w:r>
-        <w:t xml:space="preserve">). Comparar só dentro da</w:t>
-      </w:r>
-      <w:r>
-        <w:t xml:space="preserve"> </w:t>
-      </w:r>
-      <w:r>
-        <w:t xml:space="preserve">categoria — via a coluna</w:t>
-      </w:r>
-      <w:r>
-        <w:t xml:space="preserve"> </w:t>
-      </w:r>
-      <w:r>
-        <w:rPr>
-          <w:rStyle w:val="VerbatimChar"/>
-        </w:rPr>
-        <w:t xml:space="preserve">palavras_chave</w:t>
-      </w:r>
-      <w:r>
-        <w:t xml:space="preserve"> </w:t>
-      </w:r>
-      <w:r>
-        <w:t xml:space="preserve">curada de</w:t>
-      </w:r>
-      <w:r>
-        <w:t xml:space="preserve"> </w:t>
-      </w:r>
-      <w:r>
-        <w:rPr>
-          <w:rStyle w:val="VerbatimChar"/>
-        </w:rPr>
-        <w:t xml:space="preserve">seeds/catmat_saude.csv</w:t>
-      </w:r>
-      <w:r>
-        <w:t xml:space="preserve"> </w:t>
-      </w:r>
-      <w:r>
-        <w:t xml:space="preserve">—</w:t>
-      </w:r>
-      <w:r>
-        <w:t xml:space="preserve"> </w:t>
-      </w:r>
-      <w:r>
-        <w:t xml:space="preserve">evita o falso-positivo de confrontar o preço de uma seringa com o de um</w:t>
-      </w:r>
-      <w:r>
-        <w:t xml:space="preserve"> </w:t>
-      </w:r>
-      <w:r>
-        <w:t xml:space="preserve">tomógrafo.</w:t>
-      </w:r>
-    </w:p>
-    <w:p>
-      <w:pPr>
-        <w:pStyle w:val="BodyText"/>
-      </w:pPr>
-      <w:r>
-        <w:t xml:space="preserve">O preço por item</w:t>
-      </w:r>
-      <w:r>
-        <w:t xml:space="preserve"> </w:t>
-      </w:r>
-      <w:r>
-        <w:rPr>
-          <w:bCs/>
-          <w:b/>
-        </w:rPr>
-        <w:t xml:space="preserve">não</w:t>
-      </w:r>
-      <w:r>
-        <w:t xml:space="preserve"> </w:t>
-      </w:r>
-      <w:r>
-        <w:t xml:space="preserve">vem do recurso de consulta genérico do PNCP (esse só</w:t>
-      </w:r>
-      <w:r>
-        <w:t xml:space="preserve"> </w:t>
-      </w:r>
-      <w:r>
-        <w:t xml:space="preserve">traz o valor total da compra); vem de</w:t>
-      </w:r>
-      <w:r>
-        <w:t xml:space="preserve"> </w:t>
-      </w:r>
-      <w:r>
-        <w:rPr>
-          <w:rStyle w:val="VerbatimChar"/>
-        </w:rPr>
-        <w:t xml:space="preserve">/v1/orgaos/{cnpj}/compras/{ano}/{seq}/itens</w:t>
-      </w:r>
-      <w:r>
-        <w:t xml:space="preserve">.</w:t>
-      </w:r>
-      <w:r>
-        <w:t xml:space="preserve"> </w:t>
-      </w:r>
-      <w:r>
-        <w:rPr>
-          <w:rStyle w:val="VerbatimChar"/>
-        </w:rPr>
-        <w:t xml:space="preserve">ingest/pncp_itens.py</w:t>
-      </w:r>
-      <w:r>
-        <w:t xml:space="preserve"> </w:t>
-      </w:r>
-      <w:r>
-        <w:t xml:space="preserve">percorre</w:t>
-      </w:r>
-      <w:r>
-        <w:t xml:space="preserve"> </w:t>
-      </w:r>
-      <w:r>
-        <w:t xml:space="preserve">esse recurso para as ~800 contratações de saúde (modalidades Pregão, Dispensa e</w:t>
-      </w:r>
-      <w:r>
-        <w:t xml:space="preserve"> </w:t>
-      </w:r>
-      <w:r>
-        <w:t xml:space="preserve">Inexigibilidade; Concorrência é obra, sem preço unitário comparável), de forma</w:t>
-      </w:r>
-      <w:r>
-        <w:t xml:space="preserve"> </w:t>
-      </w:r>
-      <w:r>
-        <w:t xml:space="preserve">retomável. Só entram itens</w:t>
-      </w:r>
-      <w:r>
-        <w:t xml:space="preserve"> </w:t>
-      </w:r>
-      <w:r>
-        <w:rPr>
-          <w:rStyle w:val="VerbatimChar"/>
-        </w:rPr>
-        <w:t xml:space="preserve">Material</w:t>
-      </w:r>
-      <w:r>
-        <w:t xml:space="preserve"> </w:t>
-      </w:r>
-      <w:r>
-        <w:t xml:space="preserve">sem orçamento sigiloso.</w:t>
-      </w:r>
-    </w:p>
-    <w:bookmarkEnd w:id="40"/>
-    <w:bookmarkStart w:id="41" w:name="detector-4-suspeita-de-desabastecimento"/>
-    <w:p>
-      <w:pPr>
-        <w:pStyle w:val="Heading2"/>
-      </w:pPr>
-      <w:r>
-        <w:t xml:space="preserve">7.3 Detector 4 — suspeita de desabastecimento</w:t>
-      </w:r>
-    </w:p>
-    <w:p>
-      <w:pPr>
-        <w:pStyle w:val="FirstParagraph"/>
-      </w:pPr>
-      <w:r>
-        <w:t xml:space="preserve">O detector mais original do projeto. Liga</w:t>
-      </w:r>
-      <w:r>
-        <w:t xml:space="preserve"> </w:t>
-      </w:r>
-      <w:r>
-        <w:rPr>
-          <w:bCs/>
-          <w:b/>
-        </w:rPr>
-        <w:t xml:space="preserve">incidência sustentada de um agravo</w:t>
-      </w:r>
-      <w:r>
-        <w:t xml:space="preserve"> </w:t>
-      </w:r>
-      <w:r>
-        <w:t xml:space="preserve">(SINAN, taxa no percentil 75+ de PE num ano) à</w:t>
-      </w:r>
-      <w:r>
-        <w:t xml:space="preserve"> </w:t>
-      </w:r>
-      <w:r>
-        <w:rPr>
-          <w:bCs/>
-          <w:b/>
-        </w:rPr>
-        <w:t xml:space="preserve">ausência de contratação da</w:t>
-      </w:r>
-      <w:r>
-        <w:rPr>
-          <w:bCs/>
-          <w:b/>
-        </w:rPr>
-        <w:t xml:space="preserve"> </w:t>
-      </w:r>
-      <w:r>
-        <w:rPr>
-          <w:bCs/>
-          <w:b/>
-        </w:rPr>
-        <w:t xml:space="preserve">categoria de insumo correspondente</w:t>
-      </w:r>
-      <w:r>
-        <w:t xml:space="preserve"> </w:t>
-      </w:r>
-      <w:r>
-        <w:t xml:space="preserve">no PNCP, via o mapa</w:t>
-      </w:r>
-      <w:r>
-        <w:t xml:space="preserve"> </w:t>
-      </w:r>
-      <w:r>
-        <w:rPr>
-          <w:rStyle w:val="VerbatimChar"/>
-        </w:rPr>
-        <w:t xml:space="preserve">seeds/agravo_insumo.yml</w:t>
-      </w:r>
-      <w:r>
-        <w:t xml:space="preserve"> </w:t>
-      </w:r>
-      <w:r>
-        <w:t xml:space="preserve">(dengue → larvicida, inseticida, teste NS1, soro;</w:t>
-      </w:r>
-      <w:r>
-        <w:t xml:space="preserve"> </w:t>
-      </w:r>
-      <w:r>
-        <w:t xml:space="preserve">leptospirose → antibiótico penicilina, kit sorológico; etc.).</w:t>
-      </w:r>
-    </w:p>
-    <w:p>
-      <w:pPr>
-        <w:pStyle w:val="BodyText"/>
-      </w:pPr>
-      <w:r>
-        <w:t xml:space="preserve">Uma salvaguarda importante: o detector</w:t>
-      </w:r>
-      <w:r>
-        <w:t xml:space="preserve"> </w:t>
-      </w:r>
-      <w:r>
-        <w:rPr>
-          <w:bCs/>
-          <w:b/>
-        </w:rPr>
-        <w:t xml:space="preserve">só considera município-ano que aparece</w:t>
-      </w:r>
-      <w:r>
-        <w:rPr>
-          <w:bCs/>
-          <w:b/>
-        </w:rPr>
-        <w:t xml:space="preserve"> </w:t>
-      </w:r>
-      <w:r>
-        <w:rPr>
-          <w:bCs/>
-          <w:b/>
-        </w:rPr>
-        <w:t xml:space="preserve">no PNCP naquele ano</w:t>
-      </w:r>
-      <w:r>
-        <w:t xml:space="preserve">. Um município em surto que não publicou nenhuma</w:t>
-      </w:r>
-      <w:r>
-        <w:t xml:space="preserve"> </w:t>
-      </w:r>
-      <w:r>
-        <w:t xml:space="preserve">contratação é</w:t>
+        <w:t xml:space="preserve">Ao contrário do detector 1,</w:t>
+      </w:r>
+      <w:r>
+        <w:t xml:space="preserve"> </w:t>
+      </w:r>
+      <w:r>
+        <w:rPr>
+          <w:bCs/>
+          <w:b/>
+        </w:rPr>
+        <w:t xml:space="preserve">controla pela relação necessidade→alocação do</w:t>
+      </w:r>
+      <w:r>
+        <w:rPr>
+          <w:bCs/>
+          <w:b/>
+        </w:rPr>
+        <w:t xml:space="preserve"> </w:t>
+      </w:r>
+      <w:r>
+        <w:rPr>
+          <w:bCs/>
+          <w:b/>
+        </w:rPr>
+        <w:t xml:space="preserve">estado inteiro</w:t>
+      </w:r>
+      <w:r>
+        <w:t xml:space="preserve">: ajusta, por ano, uma reta</w:t>
+      </w:r>
+      <w:r>
+        <w:t xml:space="preserve"> </w:t>
+      </w:r>
+      <w:r>
+        <w:rPr>
+          <w:rStyle w:val="VerbatimChar"/>
+        </w:rPr>
+        <w:t xml:space="preserve">alocacao_rank ~ necessidade_rank</w:t>
+      </w:r>
+      <w:r>
+        <w:t xml:space="preserve"> </w:t>
+      </w:r>
+      <w:r>
+        <w:t xml:space="preserve">e mede o resíduo de cada município, com escala robusta (1,4826·MAD, para que os</w:t>
+      </w:r>
+      <w:r>
+        <w:t xml:space="preserve"> </w:t>
+      </w:r>
+      <w:r>
+        <w:t xml:space="preserve">próprios</w:t>
       </w:r>
       <w:r>
         <w:t xml:space="preserve"> </w:t>
@@ -6552,13 +6395,394 @@
           <w:iCs/>
           <w:i/>
         </w:rPr>
-        <w:t xml:space="preserve">lacuna de dado</w:t>
-      </w:r>
-      <w:r>
-        <w:t xml:space="preserve"> </w:t>
-      </w:r>
-      <w:r>
-        <w:t xml:space="preserve">(o PNCP ainda não é universal), não</w:t>
+        <w:t xml:space="preserve">outliers</w:t>
+      </w:r>
+      <w:r>
+        <w:t xml:space="preserve"> </w:t>
+      </w:r>
+      <w:r>
+        <w:t xml:space="preserve">não inflem o corte). Sinaliza quem tem resíduo padronizado</w:t>
+      </w:r>
+      <w:r>
+        <w:t xml:space="preserve"> </w:t>
+      </w:r>
+      <w:r>
+        <w:t xml:space="preserve">≤ −2</w:t>
+      </w:r>
+      <w:r>
+        <w:t xml:space="preserve"> </w:t>
+      </w:r>
+      <w:r>
+        <w:rPr>
+          <w:bCs/>
+          <w:b/>
+        </w:rPr>
+        <w:t xml:space="preserve">e</w:t>
+      </w:r>
+      <w:r>
+        <w:t xml:space="preserve"> </w:t>
+      </w:r>
+      <w:r>
+        <w:t xml:space="preserve">pelo menos 8 pontos percentuais abaixo do previsto — alocação</w:t>
+      </w:r>
+      <w:r>
+        <w:t xml:space="preserve"> </w:t>
+      </w:r>
+      <w:r>
+        <w:t xml:space="preserve">sistematicamente aquém, dado o padrão do estado. Só roda sobre município-anos</w:t>
+      </w:r>
+      <w:r>
+        <w:t xml:space="preserve"> </w:t>
+      </w:r>
+      <w:r>
+        <w:t xml:space="preserve">com o eixo de Alocação inteiro (L1+L2+L3), então hoje cobre os 76 município-anos</w:t>
+      </w:r>
+      <w:r>
+        <w:t xml:space="preserve"> </w:t>
+      </w:r>
+      <w:r>
+        <w:t xml:space="preserve">que têm as três camadas.</w:t>
+      </w:r>
+    </w:p>
+    <w:bookmarkEnd w:id="40"/>
+    <w:bookmarkStart w:id="41" w:name="detector-3-suspeita-de-sobrepreço"/>
+    <w:p>
+      <w:pPr>
+        <w:pStyle w:val="Heading2"/>
+      </w:pPr>
+      <w:r>
+        <w:t xml:space="preserve">7.3 Detector 3 — suspeita de sobrepreço</w:t>
+      </w:r>
+    </w:p>
+    <w:p>
+      <w:pPr>
+        <w:pStyle w:val="FirstParagraph"/>
+      </w:pPr>
+      <w:r>
+        <w:t xml:space="preserve">Preço unitário de um item de insumo acima de</w:t>
+      </w:r>
+      <w:r>
+        <w:t xml:space="preserve"> </w:t>
+      </w:r>
+      <w:r>
+        <w:rPr>
+          <w:bCs/>
+          <w:b/>
+        </w:rPr>
+        <w:t xml:space="preserve">Q3 + fator·IQR</w:t>
+      </w:r>
+      <w:r>
+        <w:t xml:space="preserve"> </w:t>
+      </w:r>
+      <w:r>
+        <w:t xml:space="preserve">da distribuição</w:t>
+      </w:r>
+      <w:r>
+        <w:t xml:space="preserve"> </w:t>
+      </w:r>
+      <w:r>
+        <w:t xml:space="preserve">da</w:t>
+      </w:r>
+      <w:r>
+        <w:t xml:space="preserve"> </w:t>
+      </w:r>
+      <w:r>
+        <w:rPr>
+          <w:bCs/>
+          <w:b/>
+        </w:rPr>
+        <w:t xml:space="preserve">mesma categoria e da mesma unidade de medida</w:t>
+      </w:r>
+      <w:r>
+        <w:t xml:space="preserve"> </w:t>
+      </w:r>
+      <w:r>
+        <w:t xml:space="preserve">em PE (</w:t>
+      </w:r>
+      <w:r>
+        <w:rPr>
+          <w:rStyle w:val="VerbatimChar"/>
+        </w:rPr>
+        <w:t xml:space="preserve">fator</w:t>
+      </w:r>
+      <w:r>
+        <w:t xml:space="preserve"> </w:t>
+      </w:r>
+      <w:r>
+        <w:t xml:space="preserve">em</w:t>
+      </w:r>
+      <w:r>
+        <w:t xml:space="preserve"> </w:t>
+      </w:r>
+      <w:r>
+        <w:rPr>
+          <w:rStyle w:val="VerbatimChar"/>
+        </w:rPr>
+        <w:t xml:space="preserve">conf/ieas.yml</w:t>
+      </w:r>
+      <w:r>
+        <w:t xml:space="preserve">). Comparar só dentro de (categoria, unidade) — a categoria via</w:t>
+      </w:r>
+      <w:r>
+        <w:t xml:space="preserve"> </w:t>
+      </w:r>
+      <w:r>
+        <w:t xml:space="preserve">a coluna</w:t>
+      </w:r>
+      <w:r>
+        <w:t xml:space="preserve"> </w:t>
+      </w:r>
+      <w:r>
+        <w:rPr>
+          <w:rStyle w:val="VerbatimChar"/>
+        </w:rPr>
+        <w:t xml:space="preserve">palavras_chave</w:t>
+      </w:r>
+      <w:r>
+        <w:t xml:space="preserve"> </w:t>
+      </w:r>
+      <w:r>
+        <w:t xml:space="preserve">curada de</w:t>
+      </w:r>
+      <w:r>
+        <w:t xml:space="preserve"> </w:t>
+      </w:r>
+      <w:r>
+        <w:rPr>
+          <w:rStyle w:val="VerbatimChar"/>
+        </w:rPr>
+        <w:t xml:space="preserve">seeds/catmat_saude.csv</w:t>
+      </w:r>
+      <w:r>
+        <w:t xml:space="preserve">, a unidade</w:t>
+      </w:r>
+      <w:r>
+        <w:t xml:space="preserve"> </w:t>
+      </w:r>
+      <w:r>
+        <w:t xml:space="preserve">normalizada (frasco/ampola/comprimido/…) — evita confrontar o preço de uma</w:t>
+      </w:r>
+      <w:r>
+        <w:t xml:space="preserve"> </w:t>
+      </w:r>
+      <w:r>
+        <w:t xml:space="preserve">seringa com o de um tomógrafo, ou de um frasco com o de uma ampola.</w:t>
+      </w:r>
+    </w:p>
+    <w:p>
+      <w:pPr>
+        <w:pStyle w:val="BodyText"/>
+      </w:pPr>
+      <w:r>
+        <w:t xml:space="preserve">O preço por item</w:t>
+      </w:r>
+      <w:r>
+        <w:t xml:space="preserve"> </w:t>
+      </w:r>
+      <w:r>
+        <w:rPr>
+          <w:bCs/>
+          <w:b/>
+        </w:rPr>
+        <w:t xml:space="preserve">não</w:t>
+      </w:r>
+      <w:r>
+        <w:t xml:space="preserve"> </w:t>
+      </w:r>
+      <w:r>
+        <w:t xml:space="preserve">vem do recurso de consulta genérico do PNCP (esse só</w:t>
+      </w:r>
+      <w:r>
+        <w:t xml:space="preserve"> </w:t>
+      </w:r>
+      <w:r>
+        <w:t xml:space="preserve">traz o valor total da compra); vem de</w:t>
+      </w:r>
+      <w:r>
+        <w:t xml:space="preserve"> </w:t>
+      </w:r>
+      <w:r>
+        <w:rPr>
+          <w:rStyle w:val="VerbatimChar"/>
+        </w:rPr>
+        <w:t xml:space="preserve">/v1/orgaos/{cnpj}/compras/{ano}/{seq}/itens</w:t>
+      </w:r>
+      <w:r>
+        <w:t xml:space="preserve">.</w:t>
+      </w:r>
+      <w:r>
+        <w:t xml:space="preserve"> </w:t>
+      </w:r>
+      <w:r>
+        <w:rPr>
+          <w:rStyle w:val="VerbatimChar"/>
+        </w:rPr>
+        <w:t xml:space="preserve">ingest/pncp_itens.py</w:t>
+      </w:r>
+      <w:r>
+        <w:t xml:space="preserve"> </w:t>
+      </w:r>
+      <w:r>
+        <w:t xml:space="preserve">percorre</w:t>
+      </w:r>
+      <w:r>
+        <w:t xml:space="preserve"> </w:t>
+      </w:r>
+      <w:r>
+        <w:t xml:space="preserve">esse recurso para as ~800 contratações de saúde (modalidades Pregão, Dispensa e</w:t>
+      </w:r>
+      <w:r>
+        <w:t xml:space="preserve"> </w:t>
+      </w:r>
+      <w:r>
+        <w:t xml:space="preserve">Inexigibilidade; Concorrência é obra, sem preço unitário comparável), de forma</w:t>
+      </w:r>
+      <w:r>
+        <w:t xml:space="preserve"> </w:t>
+      </w:r>
+      <w:r>
+        <w:t xml:space="preserve">retomável. Só entram itens</w:t>
+      </w:r>
+      <w:r>
+        <w:t xml:space="preserve"> </w:t>
+      </w:r>
+      <w:r>
+        <w:rPr>
+          <w:rStyle w:val="VerbatimChar"/>
+        </w:rPr>
+        <w:t xml:space="preserve">Material</w:t>
+      </w:r>
+      <w:r>
+        <w:t xml:space="preserve"> </w:t>
+      </w:r>
+      <w:r>
+        <w:t xml:space="preserve">sem orçamento sigiloso.</w:t>
+      </w:r>
+    </w:p>
+    <w:bookmarkEnd w:id="41"/>
+    <w:bookmarkStart w:id="42" w:name="detector-4-suspeita-de-desabastecimento"/>
+    <w:p>
+      <w:pPr>
+        <w:pStyle w:val="Heading2"/>
+      </w:pPr>
+      <w:r>
+        <w:t xml:space="preserve">7.4 Detector 4 — suspeita de desabastecimento</w:t>
+      </w:r>
+    </w:p>
+    <w:p>
+      <w:pPr>
+        <w:pStyle w:val="FirstParagraph"/>
+      </w:pPr>
+      <w:r>
+        <w:t xml:space="preserve">O detector mais original do projeto. Liga</w:t>
+      </w:r>
+      <w:r>
+        <w:t xml:space="preserve"> </w:t>
+      </w:r>
+      <w:r>
+        <w:rPr>
+          <w:bCs/>
+          <w:b/>
+        </w:rPr>
+        <w:t xml:space="preserve">incidência sustentada de um agravo</w:t>
+      </w:r>
+      <w:r>
+        <w:t xml:space="preserve"> </w:t>
+      </w:r>
+      <w:r>
+        <w:t xml:space="preserve">(SINAN, taxa no percentil 75+ de PE num ano) à</w:t>
+      </w:r>
+      <w:r>
+        <w:t xml:space="preserve"> </w:t>
+      </w:r>
+      <w:r>
+        <w:rPr>
+          <w:bCs/>
+          <w:b/>
+        </w:rPr>
+        <w:t xml:space="preserve">ausência de contratação da</w:t>
+      </w:r>
+      <w:r>
+        <w:rPr>
+          <w:bCs/>
+          <w:b/>
+        </w:rPr>
+        <w:t xml:space="preserve"> </w:t>
+      </w:r>
+      <w:r>
+        <w:rPr>
+          <w:bCs/>
+          <w:b/>
+        </w:rPr>
+        <w:t xml:space="preserve">categoria de insumo correspondente</w:t>
+      </w:r>
+      <w:r>
+        <w:t xml:space="preserve"> </w:t>
+      </w:r>
+      <w:r>
+        <w:t xml:space="preserve">no PNCP, via o mapa</w:t>
+      </w:r>
+      <w:r>
+        <w:t xml:space="preserve"> </w:t>
+      </w:r>
+      <w:r>
+        <w:rPr>
+          <w:rStyle w:val="VerbatimChar"/>
+        </w:rPr>
+        <w:t xml:space="preserve">seeds/agravo_insumo.yml</w:t>
+      </w:r>
+      <w:r>
+        <w:t xml:space="preserve"> </w:t>
+      </w:r>
+      <w:r>
+        <w:t xml:space="preserve">(dengue → larvicida, inseticida, teste NS1, soro;</w:t>
+      </w:r>
+      <w:r>
+        <w:t xml:space="preserve"> </w:t>
+      </w:r>
+      <w:r>
+        <w:t xml:space="preserve">leptospirose → antibiótico penicilina, kit sorológico; etc.).</w:t>
+      </w:r>
+    </w:p>
+    <w:p>
+      <w:pPr>
+        <w:pStyle w:val="BodyText"/>
+      </w:pPr>
+      <w:r>
+        <w:t xml:space="preserve">Uma salvaguarda importante: o detector</w:t>
+      </w:r>
+      <w:r>
+        <w:t xml:space="preserve"> </w:t>
+      </w:r>
+      <w:r>
+        <w:rPr>
+          <w:bCs/>
+          <w:b/>
+        </w:rPr>
+        <w:t xml:space="preserve">só considera município-ano que aparece</w:t>
+      </w:r>
+      <w:r>
+        <w:rPr>
+          <w:bCs/>
+          <w:b/>
+        </w:rPr>
+        <w:t xml:space="preserve"> </w:t>
+      </w:r>
+      <w:r>
+        <w:rPr>
+          <w:bCs/>
+          <w:b/>
+        </w:rPr>
+        <w:t xml:space="preserve">no PNCP naquele ano</w:t>
+      </w:r>
+      <w:r>
+        <w:t xml:space="preserve">. Um município em surto que não publicou nenhuma</w:t>
+      </w:r>
+      <w:r>
+        <w:t xml:space="preserve"> </w:t>
+      </w:r>
+      <w:r>
+        <w:t xml:space="preserve">contratação é</w:t>
       </w:r>
       <w:r>
         <w:t xml:space="preserve"> </w:t>
@@ -6568,20 +6792,36 @@
           <w:iCs/>
           <w:i/>
         </w:rPr>
-        <w:t xml:space="preserve">falha de</w:t>
+        <w:t xml:space="preserve">lacuna de dado</w:t>
+      </w:r>
+      <w:r>
+        <w:t xml:space="preserve"> </w:t>
+      </w:r>
+      <w:r>
+        <w:t xml:space="preserve">(o PNCP ainda não é universal), não</w:t>
+      </w:r>
+      <w:r>
+        <w:t xml:space="preserve"> </w:t>
       </w:r>
       <w:r>
         <w:rPr>
           <w:iCs/>
           <w:i/>
         </w:rPr>
-        <w:t xml:space="preserve"> </w:t>
+        <w:t xml:space="preserve">falha de</w:t>
       </w:r>
       <w:r>
         <w:rPr>
           <w:iCs/>
           <w:i/>
         </w:rPr>
+        <w:t xml:space="preserve"> </w:t>
+      </w:r>
+      <w:r>
+        <w:rPr>
+          <w:iCs/>
+          <w:i/>
+        </w:rPr>
         <w:t xml:space="preserve">política</w:t>
       </w:r>
       <w:r>
@@ -6595,20 +6835,6 @@
       </w:r>
       <w:r>
         <w:t xml:space="preserve">falso.</w:t>
-      </w:r>
-    </w:p>
-    <w:p>
-      <w:pPr>
-        <w:pStyle w:val="BodyText"/>
-      </w:pPr>
-      <w:r>
-        <w:t xml:space="preserve">O detector 2 (resíduo de regressão robusta) fica de fora: exige o eixo de</w:t>
-      </w:r>
-      <w:r>
-        <w:t xml:space="preserve"> </w:t>
-      </w:r>
-      <w:r>
-        <w:t xml:space="preserve">Alocação completo (L1+L2+L3), e L1/L2 seguem bloqueados.</w:t>
       </w:r>
     </w:p>
     <w:p>
@@ -6618,9 +6844,9 @@
         </w:pict>
       </w:r>
     </w:p>
-    <w:bookmarkEnd w:id="41"/>
     <w:bookmarkEnd w:id="42"/>
-    <w:bookmarkStart w:id="45" w:name="camada-de-apresentação"/>
+    <w:bookmarkEnd w:id="43"/>
+    <w:bookmarkStart w:id="46" w:name="camada-de-apresentação"/>
     <w:p>
       <w:pPr>
         <w:pStyle w:val="Heading1"/>
@@ -6629,7 +6855,7 @@
         <w:t xml:space="preserve">8. Camada de apresentação</w:t>
       </w:r>
     </w:p>
-    <w:bookmarkStart w:id="43" w:name="painel-streamlit-make-app"/>
+    <w:bookmarkStart w:id="44" w:name="painel-streamlit-make-app"/>
     <w:p>
       <w:pPr>
         <w:pStyle w:val="Heading2"/>
@@ -7165,8 +7391,8 @@
         <w:t xml:space="preserve">da categoria e uma tabela alternativa.</w:t>
       </w:r>
     </w:p>
-    <w:bookmarkEnd w:id="43"/>
-    <w:bookmarkStart w:id="44" w:name="api-aberta-fastapi-make-api"/>
+    <w:bookmarkEnd w:id="44"/>
+    <w:bookmarkStart w:id="45" w:name="api-aberta-fastapi-make-api"/>
     <w:p>
       <w:pPr>
         <w:pStyle w:val="Heading2"/>
@@ -7468,9 +7694,9 @@
         </w:pict>
       </w:r>
     </w:p>
-    <w:bookmarkEnd w:id="44"/>
     <w:bookmarkEnd w:id="45"/>
-    <w:bookmarkStart w:id="49" w:name="resultados"/>
+    <w:bookmarkEnd w:id="46"/>
+    <w:bookmarkStart w:id="50" w:name="resultados"/>
     <w:p>
       <w:pPr>
         <w:pStyle w:val="Heading1"/>
@@ -7479,7 +7705,7 @@
         <w:t xml:space="preserve">9. Resultados</w:t>
       </w:r>
     </w:p>
-    <w:bookmarkStart w:id="46" w:name="volume-ingerido"/>
+    <w:bookmarkStart w:id="47" w:name="volume-ingerido"/>
     <w:p>
       <w:pPr>
         <w:pStyle w:val="Heading2"/>
@@ -7854,7 +8080,7 @@
               <w:jc w:val="left"/>
             </w:pPr>
             <w:r>
-              <w:t xml:space="preserve">itens com preço unitário (contratações de saúde)</w:t>
+              <w:t xml:space="preserve">itens com preço unitário (801 contratos de saúde)</w:t>
             </w:r>
           </w:p>
         </w:tc>
@@ -7872,12 +8098,6 @@
               </w:rPr>
               <w:t xml:space="preserve">4.691</w:t>
             </w:r>
-            <w:r>
-              <w:t xml:space="preserve"> </w:t>
-            </w:r>
-            <w:r>
-              <w:t xml:space="preserve">de 878 contratações</w:t>
-            </w:r>
           </w:p>
         </w:tc>
       </w:tr>
@@ -7924,7 +8144,7 @@
               <w:t xml:space="preserve"> </w:t>
             </w:r>
             <w:r>
-              <w:t xml:space="preserve">(184/185 municípios × 5 anos)</w:t>
+              <w:t xml:space="preserve">(184/185 × 5 anos)</w:t>
             </w:r>
           </w:p>
         </w:tc>
@@ -7950,7 +8170,7 @@
               <w:jc w:val="left"/>
             </w:pPr>
             <w:r>
-              <w:t xml:space="preserve">município-anos de extrema pobreza</w:t>
+              <w:t xml:space="preserve">município-anos de taxa de extrema pobreza</w:t>
             </w:r>
           </w:p>
         </w:tc>
@@ -7986,6 +8206,102 @@
               <w:jc w:val="left"/>
             </w:pPr>
             <w:r>
+              <w:t xml:space="preserve">IBGE Censo 2022</w:t>
+            </w:r>
+          </w:p>
+        </w:tc>
+        <w:tc>
+          <w:tcPr/>
+          <w:p>
+            <w:pPr>
+              <w:pStyle w:val="Compact"/>
+              <w:jc w:val="left"/>
+            </w:pPr>
+            <w:r>
+              <w:t xml:space="preserve">municípios com déficit de água/esgoto/lixo</w:t>
+            </w:r>
+          </w:p>
+        </w:tc>
+        <w:tc>
+          <w:tcPr/>
+          <w:p>
+            <w:pPr>
+              <w:pStyle w:val="Compact"/>
+              <w:jc w:val="left"/>
+            </w:pPr>
+            <w:r>
+              <w:rPr>
+                <w:bCs/>
+                <w:b/>
+              </w:rPr>
+              <w:t xml:space="preserve">185/185</w:t>
+            </w:r>
+            <w:r>
+              <w:t xml:space="preserve"> </w:t>
+            </w:r>
+            <w:r>
+              <w:t xml:space="preserve">(cobertura mediana: água 64%, esgoto 48%, lixo 74%)</w:t>
+            </w:r>
+          </w:p>
+        </w:tc>
+      </w:tr>
+      <w:tr>
+        <w:tc>
+          <w:tcPr/>
+          <w:p>
+            <w:pPr>
+              <w:pStyle w:val="Compact"/>
+              <w:jc w:val="left"/>
+            </w:pPr>
+            <w:r>
+              <w:t xml:space="preserve">Transparência (L1 parcial)</w:t>
+            </w:r>
+          </w:p>
+        </w:tc>
+        <w:tc>
+          <w:tcPr/>
+          <w:p>
+            <w:pPr>
+              <w:pStyle w:val="Compact"/>
+              <w:jc w:val="left"/>
+            </w:pPr>
+            <w:r>
+              <w:t xml:space="preserve">município-anos de transferências sociais federais</w:t>
+            </w:r>
+          </w:p>
+        </w:tc>
+        <w:tc>
+          <w:tcPr/>
+          <w:p>
+            <w:pPr>
+              <w:pStyle w:val="Compact"/>
+              <w:jc w:val="left"/>
+            </w:pPr>
+            <w:r>
+              <w:rPr>
+                <w:bCs/>
+                <w:b/>
+              </w:rPr>
+              <w:t xml:space="preserve">209</w:t>
+            </w:r>
+            <w:r>
+              <w:t xml:space="preserve"> </w:t>
+            </w:r>
+            <w:r>
+              <w:t xml:space="preserve">(42/185 municípios; coleta interrompida por bloqueio da chave)</w:t>
+            </w:r>
+          </w:p>
+        </w:tc>
+      </w:tr>
+      <w:tr>
+        <w:tc>
+          <w:tcPr/>
+          <w:p>
+            <w:pPr>
+              <w:pStyle w:val="Compact"/>
+              <w:jc w:val="left"/>
+            </w:pPr>
+            <w:r>
               <w:t xml:space="preserve">Gold</w:t>
             </w:r>
           </w:p>
@@ -8041,19 +8357,19 @@
               <w:jc w:val="left"/>
             </w:pPr>
             <w:r>
-              <w:t xml:space="preserve">município-anos com L3</w:t>
-            </w:r>
-          </w:p>
-        </w:tc>
-        <w:tc>
-          <w:tcPr/>
-          <w:p>
-            <w:pPr>
-              <w:pStyle w:val="Compact"/>
-              <w:jc w:val="left"/>
-            </w:pPr>
-            <w:r>
-              <w:t xml:space="preserve">336</w:t>
+              <w:t xml:space="preserve">município-anos com L3 / L1</w:t>
+            </w:r>
+          </w:p>
+        </w:tc>
+        <w:tc>
+          <w:tcPr/>
+          <w:p>
+            <w:pPr>
+              <w:pStyle w:val="Compact"/>
+              <w:jc w:val="left"/>
+            </w:pPr>
+            <w:r>
+              <w:t xml:space="preserve">336 / 209</w:t>
             </w:r>
           </w:p>
         </w:tc>
@@ -8101,8 +8417,8 @@
         <w:t xml:space="preserve">análise retrospectiva.</w:t>
       </w:r>
     </w:p>
-    <w:bookmarkEnd w:id="46"/>
-    <w:bookmarkStart w:id="47" w:name="ieas"/>
+    <w:bookmarkEnd w:id="47"/>
+    <w:bookmarkStart w:id="48" w:name="ieas"/>
     <w:p>
       <w:pPr>
         <w:pStyle w:val="Heading2"/>
@@ -8176,7 +8492,7 @@
                 <w:bCs/>
                 <w:b/>
               </w:rPr>
-              <w:t xml:space="preserve">335 de 925</w:t>
+              <w:t xml:space="preserve">468 de 925</w:t>
             </w:r>
           </w:p>
         </w:tc>
@@ -8202,7 +8518,7 @@
               <w:jc w:val="left"/>
             </w:pPr>
             <w:r>
-              <w:t xml:space="preserve">130 verde · 92 vermelho · 62 azul · 51 amarelo · 590 cinza</w:t>
+              <w:t xml:space="preserve">166 verde · 109 vermelho · 104 azul · 89 amarelo · 457 cinza</w:t>
             </w:r>
           </w:p>
         </w:tc>
@@ -8228,7 +8544,7 @@
               <w:jc w:val="left"/>
             </w:pPr>
             <w:r>
-              <w:t xml:space="preserve">68 verde · 41 azul · 26 amarelo · 21 vermelho · 29 cinza</w:t>
+              <w:t xml:space="preserve">64 verde · 36 azul · 31 amarelo · 30 vermelho · 24 cinza</w:t>
             </w:r>
           </w:p>
         </w:tc>
@@ -8254,7 +8570,17 @@
               <w:jc w:val="left"/>
             </w:pPr>
             <w:r>
-              <w:t xml:space="preserve">0,67 (uniforme) — epidemiológico + vulnerabilidade</w:t>
+              <w:rPr>
+                <w:bCs/>
+                <w:b/>
+              </w:rPr>
+              <w:t xml:space="preserve">1,00 para todos</w:t>
+            </w:r>
+            <w:r>
+              <w:t xml:space="preserve"> </w:t>
+            </w:r>
+            <w:r>
+              <w:t xml:space="preserve">— epidemiológico + saneamento + vulnerabilidade</w:t>
             </w:r>
           </w:p>
         </w:tc>
@@ -8280,7 +8606,7 @@
               <w:jc w:val="left"/>
             </w:pPr>
             <w:r>
-              <w:t xml:space="preserve">0,67 onde há L2 + L3; 0,33 onde só L2</w:t>
+              <w:t xml:space="preserve">1,00 (L1+L2+L3) em 76 · 0,67 (L2+L3) em 392 · 0,33 (só L2) em 453</w:t>
             </w:r>
           </w:p>
         </w:tc>
@@ -8407,55 +8733,55 @@
               <w:jc w:val="left"/>
             </w:pPr>
             <w:r>
-              <w:t xml:space="preserve">—</w:t>
-            </w:r>
-          </w:p>
-        </w:tc>
-        <w:tc>
-          <w:tcPr/>
-          <w:p>
-            <w:pPr>
-              <w:pStyle w:val="Compact"/>
-              <w:jc w:val="left"/>
-            </w:pPr>
-            <w:r>
-              <w:t xml:space="preserve">—</w:t>
-            </w:r>
-          </w:p>
-        </w:tc>
-        <w:tc>
-          <w:tcPr/>
-          <w:p>
-            <w:pPr>
-              <w:pStyle w:val="Compact"/>
-              <w:jc w:val="left"/>
-            </w:pPr>
-            <w:r>
-              <w:t xml:space="preserve">—</w:t>
-            </w:r>
-          </w:p>
-        </w:tc>
-        <w:tc>
-          <w:tcPr/>
-          <w:p>
-            <w:pPr>
-              <w:pStyle w:val="Compact"/>
-              <w:jc w:val="left"/>
-            </w:pPr>
-            <w:r>
-              <w:t xml:space="preserve">—</w:t>
-            </w:r>
-          </w:p>
-        </w:tc>
-        <w:tc>
-          <w:tcPr/>
-          <w:p>
-            <w:pPr>
-              <w:pStyle w:val="Compact"/>
-              <w:jc w:val="left"/>
-            </w:pPr>
-            <w:r>
-              <w:t xml:space="preserve">185</w:t>
+              <w:t xml:space="preserve">2</w:t>
+            </w:r>
+          </w:p>
+        </w:tc>
+        <w:tc>
+          <w:tcPr/>
+          <w:p>
+            <w:pPr>
+              <w:pStyle w:val="Compact"/>
+              <w:jc w:val="left"/>
+            </w:pPr>
+            <w:r>
+              <w:t xml:space="preserve">7</w:t>
+            </w:r>
+          </w:p>
+        </w:tc>
+        <w:tc>
+          <w:tcPr/>
+          <w:p>
+            <w:pPr>
+              <w:pStyle w:val="Compact"/>
+              <w:jc w:val="left"/>
+            </w:pPr>
+            <w:r>
+              <w:t xml:space="preserve">15</w:t>
+            </w:r>
+          </w:p>
+        </w:tc>
+        <w:tc>
+          <w:tcPr/>
+          <w:p>
+            <w:pPr>
+              <w:pStyle w:val="Compact"/>
+              <w:jc w:val="left"/>
+            </w:pPr>
+            <w:r>
+              <w:t xml:space="preserve">18</w:t>
+            </w:r>
+          </w:p>
+        </w:tc>
+        <w:tc>
+          <w:tcPr/>
+          <w:p>
+            <w:pPr>
+              <w:pStyle w:val="Compact"/>
+              <w:jc w:val="left"/>
+            </w:pPr>
+            <w:r>
+              <w:t xml:space="preserve">143</w:t>
             </w:r>
           </w:p>
         </w:tc>
@@ -8481,55 +8807,55 @@
               <w:jc w:val="left"/>
             </w:pPr>
             <w:r>
-              <w:t xml:space="preserve">3</w:t>
-            </w:r>
-          </w:p>
-        </w:tc>
-        <w:tc>
-          <w:tcPr/>
-          <w:p>
-            <w:pPr>
-              <w:pStyle w:val="Compact"/>
-              <w:jc w:val="left"/>
-            </w:pPr>
-            <w:r>
-              <w:t xml:space="preserve">1</w:t>
-            </w:r>
-          </w:p>
-        </w:tc>
-        <w:tc>
-          <w:tcPr/>
-          <w:p>
-            <w:pPr>
-              <w:pStyle w:val="Compact"/>
-              <w:jc w:val="left"/>
-            </w:pPr>
-            <w:r>
-              <w:t xml:space="preserve">2</w:t>
-            </w:r>
-          </w:p>
-        </w:tc>
-        <w:tc>
-          <w:tcPr/>
-          <w:p>
-            <w:pPr>
-              <w:pStyle w:val="Compact"/>
-              <w:jc w:val="left"/>
-            </w:pPr>
-            <w:r>
-              <w:t xml:space="preserve">0</w:t>
-            </w:r>
-          </w:p>
-        </w:tc>
-        <w:tc>
-          <w:tcPr/>
-          <w:p>
-            <w:pPr>
-              <w:pStyle w:val="Compact"/>
-              <w:jc w:val="left"/>
-            </w:pPr>
-            <w:r>
-              <w:t xml:space="preserve">179</w:t>
+              <w:t xml:space="preserve">4</w:t>
+            </w:r>
+          </w:p>
+        </w:tc>
+        <w:tc>
+          <w:tcPr/>
+          <w:p>
+            <w:pPr>
+              <w:pStyle w:val="Compact"/>
+              <w:jc w:val="left"/>
+            </w:pPr>
+            <w:r>
+              <w:t xml:space="preserve">9</w:t>
+            </w:r>
+          </w:p>
+        </w:tc>
+        <w:tc>
+          <w:tcPr/>
+          <w:p>
+            <w:pPr>
+              <w:pStyle w:val="Compact"/>
+              <w:jc w:val="left"/>
+            </w:pPr>
+            <w:r>
+              <w:t xml:space="preserve">21</w:t>
+            </w:r>
+          </w:p>
+        </w:tc>
+        <w:tc>
+          <w:tcPr/>
+          <w:p>
+            <w:pPr>
+              <w:pStyle w:val="Compact"/>
+              <w:jc w:val="left"/>
+            </w:pPr>
+            <w:r>
+              <w:t xml:space="preserve">13</w:t>
+            </w:r>
+          </w:p>
+        </w:tc>
+        <w:tc>
+          <w:tcPr/>
+          <w:p>
+            <w:pPr>
+              <w:pStyle w:val="Compact"/>
+              <w:jc w:val="left"/>
+            </w:pPr>
+            <w:r>
+              <w:t xml:space="preserve">138</w:t>
             </w:r>
           </w:p>
         </w:tc>
@@ -8555,55 +8881,55 @@
               <w:jc w:val="left"/>
             </w:pPr>
             <w:r>
-              <w:t xml:space="preserve">50</w:t>
-            </w:r>
-          </w:p>
-        </w:tc>
-        <w:tc>
-          <w:tcPr/>
-          <w:p>
-            <w:pPr>
-              <w:pStyle w:val="Compact"/>
-              <w:jc w:val="left"/>
-            </w:pPr>
-            <w:r>
-              <w:t xml:space="preserve">16</w:t>
-            </w:r>
-          </w:p>
-        </w:tc>
-        <w:tc>
-          <w:tcPr/>
-          <w:p>
-            <w:pPr>
-              <w:pStyle w:val="Compact"/>
-              <w:jc w:val="left"/>
-            </w:pPr>
-            <w:r>
-              <w:t xml:space="preserve">32</w:t>
-            </w:r>
-          </w:p>
-        </w:tc>
-        <w:tc>
-          <w:tcPr/>
-          <w:p>
-            <w:pPr>
-              <w:pStyle w:val="Compact"/>
-              <w:jc w:val="left"/>
-            </w:pPr>
-            <w:r>
-              <w:t xml:space="preserve">4</w:t>
-            </w:r>
-          </w:p>
-        </w:tc>
-        <w:tc>
-          <w:tcPr/>
-          <w:p>
-            <w:pPr>
-              <w:pStyle w:val="Compact"/>
-              <w:jc w:val="left"/>
-            </w:pPr>
-            <w:r>
-              <w:t xml:space="preserve">83</w:t>
+              <w:t xml:space="preserve">54</w:t>
+            </w:r>
+          </w:p>
+        </w:tc>
+        <w:tc>
+          <w:tcPr/>
+          <w:p>
+            <w:pPr>
+              <w:pStyle w:val="Compact"/>
+              <w:jc w:val="left"/>
+            </w:pPr>
+            <w:r>
+              <w:t xml:space="preserve">28</w:t>
+            </w:r>
+          </w:p>
+        </w:tc>
+        <w:tc>
+          <w:tcPr/>
+          <w:p>
+            <w:pPr>
+              <w:pStyle w:val="Compact"/>
+              <w:jc w:val="left"/>
+            </w:pPr>
+            <w:r>
+              <w:t xml:space="preserve">29</w:t>
+            </w:r>
+          </w:p>
+        </w:tc>
+        <w:tc>
+          <w:tcPr/>
+          <w:p>
+            <w:pPr>
+              <w:pStyle w:val="Compact"/>
+              <w:jc w:val="left"/>
+            </w:pPr>
+            <w:r>
+              <w:t xml:space="preserve">6</w:t>
+            </w:r>
+          </w:p>
+        </w:tc>
+        <w:tc>
+          <w:tcPr/>
+          <w:p>
+            <w:pPr>
+              <w:pStyle w:val="Compact"/>
+              <w:jc w:val="left"/>
+            </w:pPr>
+            <w:r>
+              <w:t xml:space="preserve">68</w:t>
             </w:r>
           </w:p>
         </w:tc>
@@ -8629,55 +8955,55 @@
               <w:jc w:val="left"/>
             </w:pPr>
             <w:r>
-              <w:t xml:space="preserve">18</w:t>
-            </w:r>
-          </w:p>
-        </w:tc>
-        <w:tc>
-          <w:tcPr/>
-          <w:p>
-            <w:pPr>
-              <w:pStyle w:val="Compact"/>
-              <w:jc w:val="left"/>
-            </w:pPr>
-            <w:r>
-              <w:t xml:space="preserve">8</w:t>
-            </w:r>
-          </w:p>
-        </w:tc>
-        <w:tc>
-          <w:tcPr/>
-          <w:p>
-            <w:pPr>
-              <w:pStyle w:val="Compact"/>
-              <w:jc w:val="left"/>
-            </w:pPr>
-            <w:r>
-              <w:t xml:space="preserve">28</w:t>
-            </w:r>
-          </w:p>
-        </w:tc>
-        <w:tc>
-          <w:tcPr/>
-          <w:p>
-            <w:pPr>
-              <w:pStyle w:val="Compact"/>
-              <w:jc w:val="left"/>
-            </w:pPr>
-            <w:r>
-              <w:t xml:space="preserve">17</w:t>
-            </w:r>
-          </w:p>
-        </w:tc>
-        <w:tc>
-          <w:tcPr/>
-          <w:p>
-            <w:pPr>
-              <w:pStyle w:val="Compact"/>
-              <w:jc w:val="left"/>
-            </w:pPr>
-            <w:r>
-              <w:t xml:space="preserve">114</w:t>
+              <w:t xml:space="preserve">19</w:t>
+            </w:r>
+          </w:p>
+        </w:tc>
+        <w:tc>
+          <w:tcPr/>
+          <w:p>
+            <w:pPr>
+              <w:pStyle w:val="Compact"/>
+              <w:jc w:val="left"/>
+            </w:pPr>
+            <w:r>
+              <w:t xml:space="preserve">14</w:t>
+            </w:r>
+          </w:p>
+        </w:tc>
+        <w:tc>
+          <w:tcPr/>
+          <w:p>
+            <w:pPr>
+              <w:pStyle w:val="Compact"/>
+              <w:jc w:val="left"/>
+            </w:pPr>
+            <w:r>
+              <w:t xml:space="preserve">37</w:t>
+            </w:r>
+          </w:p>
+        </w:tc>
+        <w:tc>
+          <w:tcPr/>
+          <w:p>
+            <w:pPr>
+              <w:pStyle w:val="Compact"/>
+              <w:jc w:val="left"/>
+            </w:pPr>
+            <w:r>
+              <w:t xml:space="preserve">31</w:t>
+            </w:r>
+          </w:p>
+        </w:tc>
+        <w:tc>
+          <w:tcPr/>
+          <w:p>
+            <w:pPr>
+              <w:pStyle w:val="Compact"/>
+              <w:jc w:val="left"/>
+            </w:pPr>
+            <w:r>
+              <w:t xml:space="preserve">84</w:t>
             </w:r>
           </w:p>
         </w:tc>
@@ -8703,55 +9029,55 @@
               <w:jc w:val="left"/>
             </w:pPr>
             <w:r>
-              <w:t xml:space="preserve">21</w:t>
-            </w:r>
-          </w:p>
-        </w:tc>
-        <w:tc>
-          <w:tcPr/>
-          <w:p>
-            <w:pPr>
-              <w:pStyle w:val="Compact"/>
-              <w:jc w:val="left"/>
-            </w:pPr>
-            <w:r>
-              <w:t xml:space="preserve">26</w:t>
-            </w:r>
-          </w:p>
-        </w:tc>
-        <w:tc>
-          <w:tcPr/>
-          <w:p>
-            <w:pPr>
-              <w:pStyle w:val="Compact"/>
-              <w:jc w:val="left"/>
-            </w:pPr>
-            <w:r>
-              <w:t xml:space="preserve">68</w:t>
-            </w:r>
-          </w:p>
-        </w:tc>
-        <w:tc>
-          <w:tcPr/>
-          <w:p>
-            <w:pPr>
-              <w:pStyle w:val="Compact"/>
-              <w:jc w:val="left"/>
-            </w:pPr>
-            <w:r>
-              <w:t xml:space="preserve">41</w:t>
-            </w:r>
-          </w:p>
-        </w:tc>
-        <w:tc>
-          <w:tcPr/>
-          <w:p>
-            <w:pPr>
-              <w:pStyle w:val="Compact"/>
-              <w:jc w:val="left"/>
-            </w:pPr>
-            <w:r>
-              <w:t xml:space="preserve">29</w:t>
+              <w:t xml:space="preserve">30</w:t>
+            </w:r>
+          </w:p>
+        </w:tc>
+        <w:tc>
+          <w:tcPr/>
+          <w:p>
+            <w:pPr>
+              <w:pStyle w:val="Compact"/>
+              <w:jc w:val="left"/>
+            </w:pPr>
+            <w:r>
+              <w:t xml:space="preserve">31</w:t>
+            </w:r>
+          </w:p>
+        </w:tc>
+        <w:tc>
+          <w:tcPr/>
+          <w:p>
+            <w:pPr>
+              <w:pStyle w:val="Compact"/>
+              <w:jc w:val="left"/>
+            </w:pPr>
+            <w:r>
+              <w:t xml:space="preserve">64</w:t>
+            </w:r>
+          </w:p>
+        </w:tc>
+        <w:tc>
+          <w:tcPr/>
+          <w:p>
+            <w:pPr>
+              <w:pStyle w:val="Compact"/>
+              <w:jc w:val="left"/>
+            </w:pPr>
+            <w:r>
+              <w:t xml:space="preserve">36</w:t>
+            </w:r>
+          </w:p>
+        </w:tc>
+        <w:tc>
+          <w:tcPr/>
+          <w:p>
+            <w:pPr>
+              <w:pStyle w:val="Compact"/>
+              <w:jc w:val="left"/>
+            </w:pPr>
+            <w:r>
+              <w:t xml:space="preserve">24</w:t>
             </w:r>
           </w:p>
         </w:tc>
@@ -8784,41 +9110,41 @@
         <w:t xml:space="preserve"> </w:t>
       </w:r>
       <w:r>
-        <w:t xml:space="preserve">fundo — concentram-se na Zona da Mata Norte e no Agreste: Aliança (necessidade</w:t>
-      </w:r>
-      <w:r>
-        <w:t xml:space="preserve"> </w:t>
-      </w:r>
-      <w:r>
-        <w:t xml:space="preserve">percentil 93, alocação 16), Paudalho (74 / 6), Bonito (88 / 21), Moreno (79 /</w:t>
-      </w:r>
-      <w:r>
-        <w:t xml:space="preserve"> </w:t>
-      </w:r>
-      <w:r>
-        <w:t xml:space="preserve">13), Catende (91 / 25). É exatamente o descompasso que o IEAS existe para</w:t>
-      </w:r>
-      <w:r>
-        <w:t xml:space="preserve"> </w:t>
-      </w:r>
-      <w:r>
-        <w:t xml:space="preserve">detectar. O subíndice epidemiológico tem média 0,50 (faixa 0,23–0,78); o de</w:t>
-      </w:r>
-      <w:r>
-        <w:t xml:space="preserve"> </w:t>
-      </w:r>
-      <w:r>
-        <w:t xml:space="preserve">vulnerabilidade, taxa de extrema pobreza mediana de ~190 famílias por mil</w:t>
-      </w:r>
-      <w:r>
-        <w:t xml:space="preserve"> </w:t>
-      </w:r>
-      <w:r>
-        <w:t xml:space="preserve">habitantes (faixa 6–608).</w:t>
-      </w:r>
-    </w:p>
-    <w:bookmarkEnd w:id="47"/>
-    <w:bookmarkStart w:id="48" w:name="alertas"/>
+        <w:t xml:space="preserve">fundo — concentram-se na Zona da Mata Norte e na Região Metropolitana: Ilha de</w:t>
+      </w:r>
+      <w:r>
+        <w:t xml:space="preserve"> </w:t>
+      </w:r>
+      <w:r>
+        <w:t xml:space="preserve">Itamaracá (necessidade percentil 95, alocação 15), Paudalho (75 / 4), Feira Nova</w:t>
+      </w:r>
+      <w:r>
+        <w:t xml:space="preserve"> </w:t>
+      </w:r>
+      <w:r>
+        <w:t xml:space="preserve">(77 / 12), Carpina (74 / 10), Pedra (88 / 24). É exatamente o descompasso que o</w:t>
+      </w:r>
+      <w:r>
+        <w:t xml:space="preserve"> </w:t>
+      </w:r>
+      <w:r>
+        <w:t xml:space="preserve">IEAS existe para detectar. As coberturas censitárias de saneamento em PE são</w:t>
+      </w:r>
+      <w:r>
+        <w:t xml:space="preserve"> </w:t>
+      </w:r>
+      <w:r>
+        <w:t xml:space="preserve">baixas — água 64%, esgoto 48%, lixo 74% na mediana —, o que puxa o subíndice de</w:t>
+      </w:r>
+      <w:r>
+        <w:t xml:space="preserve"> </w:t>
+      </w:r>
+      <w:r>
+        <w:t xml:space="preserve">Necessidade para cima em quase todo o estado.</w:t>
+      </w:r>
+    </w:p>
+    <w:bookmarkEnd w:id="48"/>
+    <w:bookmarkStart w:id="49" w:name="alertas"/>
     <w:p>
       <w:pPr>
         <w:pStyle w:val="Heading2"/>
@@ -8836,13 +9162,13 @@
           <w:bCs/>
           <w:b/>
         </w:rPr>
-        <w:t xml:space="preserve">677 alertas</w:t>
-      </w:r>
-      <w:r>
-        <w:t xml:space="preserve"> </w:t>
-      </w:r>
-      <w:r>
-        <w:t xml:space="preserve">no total:</w:t>
+        <w:t xml:space="preserve">692 alertas</w:t>
+      </w:r>
+      <w:r>
+        <w:t xml:space="preserve"> </w:t>
+      </w:r>
+      <w:r>
+        <w:t xml:space="preserve">no total, dos quatro detectores:</w:t>
       </w:r>
     </w:p>
     <w:p>
@@ -8886,19 +9212,13 @@
           <w:bCs/>
           <w:b/>
         </w:rPr>
-        <w:t xml:space="preserve">92 de desalinhamento estrutural</w:t>
-      </w:r>
-      <w:r>
-        <w:t xml:space="preserve"> </w:t>
-      </w:r>
-      <w:r>
-        <w:t xml:space="preserve">— os faróis vermelhos, agora que o índice</w:t>
-      </w:r>
-      <w:r>
-        <w:t xml:space="preserve"> </w:t>
-      </w:r>
-      <w:r>
-        <w:t xml:space="preserve">tem cor (o detector 1 não produzia nada na versão anterior).</w:t>
+        <w:t xml:space="preserve">109 de desalinhamento estrutural</w:t>
+      </w:r>
+      <w:r>
+        <w:t xml:space="preserve"> </w:t>
+      </w:r>
+      <w:r>
+        <w:t xml:space="preserve">— os faróis vermelhos.</w:t>
       </w:r>
     </w:p>
     <w:p>
@@ -8914,19 +9234,53 @@
           <w:bCs/>
           <w:b/>
         </w:rPr>
-        <w:t xml:space="preserve">4 de suspeita de sobrepreço</w:t>
-      </w:r>
-      <w:r>
-        <w:t xml:space="preserve"> </w:t>
-      </w:r>
-      <w:r>
-        <w:t xml:space="preserve">— itens de dipirona e amoxicilina+clavulanato</w:t>
-      </w:r>
-      <w:r>
-        <w:t xml:space="preserve"> </w:t>
-      </w:r>
-      <w:r>
-        <w:t xml:space="preserve">a 4,7–6,1× a mediana de PE da categoria.</w:t>
+        <w:t xml:space="preserve">1 de alocação abaixo do esperado</w:t>
+      </w:r>
+      <w:r>
+        <w:t xml:space="preserve"> </w:t>
+      </w:r>
+      <w:r>
+        <w:t xml:space="preserve">(detector 2) — hoje conservador porque só</w:t>
+      </w:r>
+      <w:r>
+        <w:t xml:space="preserve"> </w:t>
+      </w:r>
+      <w:r>
+        <w:t xml:space="preserve">76 município-anos têm o eixo de Alocação inteiro; cresce com a coleta de L1.</w:t>
+      </w:r>
+    </w:p>
+    <w:p>
+      <w:pPr>
+        <w:numPr>
+          <w:ilvl w:val="0"/>
+          <w:numId w:val="1007"/>
+        </w:numPr>
+        <w:pStyle w:val="Compact"/>
+      </w:pPr>
+      <w:r>
+        <w:rPr>
+          <w:bCs/>
+          <w:b/>
+        </w:rPr>
+        <w:t xml:space="preserve">1 de suspeita de sobrepreço</w:t>
+      </w:r>
+      <w:r>
+        <w:t xml:space="preserve"> </w:t>
+      </w:r>
+      <w:r>
+        <w:t xml:space="preserve">— após restringir a comparação a (categoria,</w:t>
+      </w:r>
+      <w:r>
+        <w:t xml:space="preserve"> </w:t>
+      </w:r>
+      <w:r>
+        <w:t xml:space="preserve">unidade de medida), sobra um item de amoxicilina em comprimido a 4,2× a</w:t>
+      </w:r>
+      <w:r>
+        <w:t xml:space="preserve"> </w:t>
+      </w:r>
+      <w:r>
+        <w:t xml:space="preserve">mediana de PE.</w:t>
       </w:r>
     </w:p>
     <w:tbl>
@@ -9155,9 +9509,9 @@
         </w:pict>
       </w:r>
     </w:p>
-    <w:bookmarkEnd w:id="48"/>
     <w:bookmarkEnd w:id="49"/>
-    <w:bookmarkStart w:id="50" w:name="limitações-e-ameaças-à-validade"/>
+    <w:bookmarkEnd w:id="50"/>
+    <w:bookmarkStart w:id="51" w:name="limitações-e-ameaças-à-validade"/>
     <w:p>
       <w:pPr>
         <w:pStyle w:val="Heading1"/>
@@ -9179,40 +9533,40 @@
           <w:bCs/>
           <w:b/>
         </w:rPr>
-        <w:t xml:space="preserve">O eixo Alocação ainda tem só 2 de 3 camadas.</w:t>
-      </w:r>
-      <w:r>
-        <w:t xml:space="preserve"> </w:t>
-      </w:r>
-      <w:r>
-        <w:t xml:space="preserve">Falta L1 (repasse federal,</w:t>
-      </w:r>
-      <w:r>
-        <w:t xml:space="preserve"> </w:t>
-      </w:r>
-      <w:r>
-        <w:t xml:space="preserve">Portal da Transparência). O</w:t>
-      </w:r>
-      <w:r>
-        <w:t xml:space="preserve"> </w:t>
-      </w:r>
-      <w:r>
-        <w:rPr>
-          <w:rStyle w:val="VerbatimChar"/>
-        </w:rPr>
-        <w:t xml:space="preserve">gap</w:t>
-      </w:r>
-      <w:r>
-        <w:t xml:space="preserve"> </w:t>
-      </w:r>
-      <w:r>
-        <w:t xml:space="preserve">de hoje compara necessidade contra L2+L3;</w:t>
-      </w:r>
-      <w:r>
-        <w:t xml:space="preserve"> </w:t>
-      </w:r>
-      <w:r>
-        <w:t xml:space="preserve">quando L1 entrar, o ranking de alocação muda para alguns municípios.</w:t>
+        <w:t xml:space="preserve">L1 (repasse federal) é parcial</w:t>
+      </w:r>
+      <w:r>
+        <w:t xml:space="preserve"> </w:t>
+      </w:r>
+      <w:r>
+        <w:t xml:space="preserve">— 42 de 185 municípios. A chave gratuita</w:t>
+      </w:r>
+      <w:r>
+        <w:t xml:space="preserve"> </w:t>
+      </w:r>
+      <w:r>
+        <w:t xml:space="preserve">do Portal da Transparência é bloqueada por volume de requisições; a coleta</w:t>
+      </w:r>
+      <w:r>
+        <w:t xml:space="preserve"> </w:t>
+      </w:r>
+      <w:r>
+        <w:t xml:space="preserve">é retomável (</w:t>
+      </w:r>
+      <w:r>
+        <w:rPr>
+          <w:rStyle w:val="VerbatimChar"/>
+        </w:rPr>
+        <w:t xml:space="preserve">farol ingest-l1</w:t>
+      </w:r>
+      <w:r>
+        <w:t xml:space="preserve">), com pausa de 1,5 s entre chamadas. Onde L1</w:t>
+      </w:r>
+      <w:r>
+        <w:t xml:space="preserve"> </w:t>
+      </w:r>
+      <w:r>
+        <w:t xml:space="preserve">ainda falta, o eixo de Alocação usa só L2+L3.</w:t>
       </w:r>
     </w:p>
     <w:p>
@@ -9228,31 +9582,40 @@
           <w:bCs/>
           <w:b/>
         </w:rPr>
-        <w:t xml:space="preserve">O subíndice de saneamento está ausente</w:t>
-      </w:r>
-      <w:r>
-        <w:t xml:space="preserve"> </w:t>
-      </w:r>
-      <w:r>
-        <w:t xml:space="preserve">(SNIS encerrado). O eixo</w:t>
-      </w:r>
-      <w:r>
-        <w:t xml:space="preserve"> </w:t>
-      </w:r>
-      <w:r>
-        <w:t xml:space="preserve">Necessidade combina epidemiologia e vulnerabilidade, mas não déficit</w:t>
-      </w:r>
-      <w:r>
-        <w:t xml:space="preserve"> </w:t>
-      </w:r>
-      <w:r>
-        <w:t xml:space="preserve">sanitário — que é justamente o elo mais forte com as doenças de veiculação</w:t>
-      </w:r>
-      <w:r>
-        <w:t xml:space="preserve"> </w:t>
-      </w:r>
-      <w:r>
-        <w:t xml:space="preserve">hídrica. Substituto planejado: Censo 2022 do IBGE.</w:t>
+        <w:t xml:space="preserve">L1 mede transferências sociais, não repasse fundo a fundo.</w:t>
+      </w:r>
+      <w:r>
+        <w:t xml:space="preserve"> </w:t>
+      </w:r>
+      <w:r>
+        <w:t xml:space="preserve">O endpoint</w:t>
+      </w:r>
+      <w:r>
+        <w:t xml:space="preserve"> </w:t>
+      </w:r>
+      <w:r>
+        <w:rPr>
+          <w:rStyle w:val="VerbatimChar"/>
+        </w:rPr>
+        <w:t xml:space="preserve">/transferencias</w:t>
+      </w:r>
+      <w:r>
+        <w:t xml:space="preserve"> </w:t>
+      </w:r>
+      <w:r>
+        <w:t xml:space="preserve">(repasse ao ente) exige acesso gov.br elevado; usamos</w:t>
+      </w:r>
+      <w:r>
+        <w:t xml:space="preserve"> </w:t>
+      </w:r>
+      <w:r>
+        <w:t xml:space="preserve">Bolsa Família + BPC por município como proxy do dinheiro federal no</w:t>
+      </w:r>
+      <w:r>
+        <w:t xml:space="preserve"> </w:t>
+      </w:r>
+      <w:r>
+        <w:t xml:space="preserve">território, documentado como tal.</w:t>
       </w:r>
     </w:p>
     <w:p>
@@ -9268,25 +9631,19 @@
           <w:bCs/>
           <w:b/>
         </w:rPr>
-        <w:t xml:space="preserve">Cobertura desigual do PNCP no tempo.</w:t>
-      </w:r>
-      <w:r>
-        <w:t xml:space="preserve"> </w:t>
-      </w:r>
-      <w:r>
-        <w:t xml:space="preserve">A camada L3 é rala em 2020–2021</w:t>
-      </w:r>
-      <w:r>
-        <w:t xml:space="preserve"> </w:t>
-      </w:r>
-      <w:r>
-        <w:t xml:space="preserve">(2020 sai inteiro cinza) e densa em 2024. Comparações entre anos devem</w:t>
-      </w:r>
-      <w:r>
-        <w:t xml:space="preserve"> </w:t>
-      </w:r>
-      <w:r>
-        <w:t xml:space="preserve">considerar isso.</w:t>
+        <w:t xml:space="preserve">Saneamento é um retrato de 2022.</w:t>
+      </w:r>
+      <w:r>
+        <w:t xml:space="preserve"> </w:t>
+      </w:r>
+      <w:r>
+        <w:t xml:space="preserve">O Censo não é anual; o mesmo déficit é</w:t>
+      </w:r>
+      <w:r>
+        <w:t xml:space="preserve"> </w:t>
+      </w:r>
+      <w:r>
+        <w:t xml:space="preserve">aplicado aos 5 anos do recorte. O SNIS, que era anual, foi encerrado.</w:t>
       </w:r>
     </w:p>
     <w:p>
@@ -9302,67 +9659,19 @@
           <w:bCs/>
           <w:b/>
         </w:rPr>
-        <w:t xml:space="preserve">Casamento compra × insumo por palavra-chave.</w:t>
-      </w:r>
-      <w:r>
-        <w:t xml:space="preserve"> </w:t>
-      </w:r>
-      <w:r>
-        <w:t xml:space="preserve">Os detectores 3 e 4 casam</w:t>
-      </w:r>
-      <w:r>
-        <w:t xml:space="preserve"> </w:t>
-      </w:r>
-      <w:r>
-        <w:t xml:space="preserve">texto de licitação com categorias de</w:t>
-      </w:r>
-      <w:r>
-        <w:t xml:space="preserve"> </w:t>
-      </w:r>
-      <w:r>
-        <w:rPr>
-          <w:rStyle w:val="VerbatimChar"/>
-        </w:rPr>
-        <w:t xml:space="preserve">seeds/catmat_saude.csv</w:t>
-      </w:r>
-      <w:r>
-        <w:t xml:space="preserve"> </w:t>
-      </w:r>
-      <w:r>
-        <w:t xml:space="preserve">por termos</w:t>
-      </w:r>
-      <w:r>
-        <w:t xml:space="preserve"> </w:t>
-      </w:r>
-      <w:r>
-        <w:t xml:space="preserve">curados, não por classificação CATMAT estruturada nem NLP. São</w:t>
-      </w:r>
-      <w:r>
-        <w:t xml:space="preserve"> </w:t>
-      </w:r>
-      <w:r>
-        <w:rPr>
-          <w:bCs/>
-          <w:b/>
-        </w:rPr>
-        <w:t xml:space="preserve">suspeitas</w:t>
-      </w:r>
-      <w:r>
-        <w:rPr>
-          <w:bCs/>
-          <w:b/>
-        </w:rPr>
-        <w:t xml:space="preserve"> </w:t>
-      </w:r>
-      <w:r>
-        <w:rPr>
-          <w:bCs/>
-          <w:b/>
-        </w:rPr>
-        <w:t xml:space="preserve">para auditoria</w:t>
-      </w:r>
-      <w:r>
-        <w:t xml:space="preserve">, não conclusões.</w:t>
+        <w:t xml:space="preserve">Cobertura desigual do PNCP no tempo.</w:t>
+      </w:r>
+      <w:r>
+        <w:t xml:space="preserve"> </w:t>
+      </w:r>
+      <w:r>
+        <w:t xml:space="preserve">A camada L3 é rala em 2020–2021 e</w:t>
+      </w:r>
+      <w:r>
+        <w:t xml:space="preserve"> </w:t>
+      </w:r>
+      <w:r>
+        <w:t xml:space="preserve">densa em 2024. Comparações entre anos devem considerar isso.</w:t>
       </w:r>
     </w:p>
     <w:p>
@@ -9378,61 +9687,67 @@
           <w:bCs/>
           <w:b/>
         </w:rPr>
-        <w:t xml:space="preserve">Detector 3 não normaliza por unidade de medida.</w:t>
-      </w:r>
-      <w:r>
-        <w:t xml:space="preserve"> </w:t>
-      </w:r>
-      <w:r>
-        <w:t xml:space="preserve">Compara preços unitários</w:t>
-      </w:r>
-      <w:r>
-        <w:t xml:space="preserve"> </w:t>
-      </w:r>
-      <w:r>
-        <w:t xml:space="preserve">de</w:t>
-      </w:r>
-      <w:r>
-        <w:t xml:space="preserve"> </w:t>
-      </w:r>
-      <w:r>
-        <w:t xml:space="preserve">“</w:t>
-      </w:r>
-      <w:r>
-        <w:t xml:space="preserve">ampola</w:t>
-      </w:r>
-      <w:r>
-        <w:t xml:space="preserve">”</w:t>
-      </w:r>
-      <w:r>
-        <w:t xml:space="preserve"> </w:t>
-      </w:r>
-      <w:r>
-        <w:t xml:space="preserve">com</w:t>
-      </w:r>
-      <w:r>
-        <w:t xml:space="preserve"> </w:t>
-      </w:r>
-      <w:r>
-        <w:t xml:space="preserve">“</w:t>
-      </w:r>
-      <w:r>
-        <w:t xml:space="preserve">frasco</w:t>
-      </w:r>
-      <w:r>
-        <w:t xml:space="preserve">”</w:t>
-      </w:r>
-      <w:r>
-        <w:t xml:space="preserve"> </w:t>
-      </w:r>
-      <w:r>
-        <w:t xml:space="preserve">dentro da mesma categoria — a explicação mostra a</w:t>
-      </w:r>
-      <w:r>
-        <w:t xml:space="preserve"> </w:t>
-      </w:r>
-      <w:r>
-        <w:t xml:space="preserve">unidade para o auditor julgar, mas o corte por IQR ainda mistura unidades.</w:t>
+        <w:t xml:space="preserve">Casamento compra × insumo por palavra-chave.</w:t>
+      </w:r>
+      <w:r>
+        <w:t xml:space="preserve"> </w:t>
+      </w:r>
+      <w:r>
+        <w:t xml:space="preserve">Os detectores 3 e 4 casam</w:t>
+      </w:r>
+      <w:r>
+        <w:t xml:space="preserve"> </w:t>
+      </w:r>
+      <w:r>
+        <w:t xml:space="preserve">texto de licitação com categorias de</w:t>
+      </w:r>
+      <w:r>
+        <w:t xml:space="preserve"> </w:t>
+      </w:r>
+      <w:r>
+        <w:rPr>
+          <w:rStyle w:val="VerbatimChar"/>
+        </w:rPr>
+        <w:t xml:space="preserve">seeds/catmat_saude.csv</w:t>
+      </w:r>
+      <w:r>
+        <w:t xml:space="preserve"> </w:t>
+      </w:r>
+      <w:r>
+        <w:t xml:space="preserve">por termos</w:t>
+      </w:r>
+      <w:r>
+        <w:t xml:space="preserve"> </w:t>
+      </w:r>
+      <w:r>
+        <w:t xml:space="preserve">curados, não por classificação CATMAT estruturada nem NLP. São</w:t>
+      </w:r>
+      <w:r>
+        <w:t xml:space="preserve"> </w:t>
+      </w:r>
+      <w:r>
+        <w:rPr>
+          <w:bCs/>
+          <w:b/>
+        </w:rPr>
+        <w:t xml:space="preserve">suspeitas</w:t>
+      </w:r>
+      <w:r>
+        <w:rPr>
+          <w:bCs/>
+          <w:b/>
+        </w:rPr>
+        <w:t xml:space="preserve"> </w:t>
+      </w:r>
+      <w:r>
+        <w:rPr>
+          <w:bCs/>
+          <w:b/>
+        </w:rPr>
+        <w:t xml:space="preserve">para auditoria</w:t>
+      </w:r>
+      <w:r>
+        <w:t xml:space="preserve">, não conclusões.</w:t>
       </w:r>
     </w:p>
     <w:p>
@@ -9448,19 +9763,7 @@
           <w:bCs/>
           <w:b/>
         </w:rPr>
-        <w:t xml:space="preserve">Rank percentil dentro de PE</w:t>
-      </w:r>
-      <w:r>
-        <w:t xml:space="preserve"> </w:t>
-      </w:r>
-      <w:r>
-        <w:t xml:space="preserve">mede posição relativa, não suficiência</w:t>
-      </w:r>
-      <w:r>
-        <w:t xml:space="preserve"> </w:t>
-      </w:r>
-      <w:r>
-        <w:t xml:space="preserve">absoluta. Um estado inteiro subfinanciado teria municípios</w:t>
+        <w:t xml:space="preserve">Detector 3 agrupa por unidade, mas não converte dose.</w:t>
       </w:r>
       <w:r>
         <w:t xml:space="preserve"> </w:t>
@@ -9469,13 +9772,46 @@
         <w:t xml:space="preserve">“</w:t>
       </w:r>
       <w:r>
-        <w:t xml:space="preserve">azuis</w:t>
+        <w:t xml:space="preserve">Comprimido de</w:t>
+      </w:r>
+      <w:r>
+        <w:t xml:space="preserve"> </w:t>
+      </w:r>
+      <w:r>
+        <w:t xml:space="preserve">500 mg</w:t>
       </w:r>
       <w:r>
         <w:t xml:space="preserve">”</w:t>
       </w:r>
       <w:r>
-        <w:t xml:space="preserve">.</w:t>
+        <w:t xml:space="preserve"> </w:t>
+      </w:r>
+      <w:r>
+        <w:t xml:space="preserve">e</w:t>
+      </w:r>
+      <w:r>
+        <w:t xml:space="preserve"> </w:t>
+      </w:r>
+      <w:r>
+        <w:t xml:space="preserve">“</w:t>
+      </w:r>
+      <w:r>
+        <w:t xml:space="preserve">comprimido de 250 mg</w:t>
+      </w:r>
+      <w:r>
+        <w:t xml:space="preserve">”</w:t>
+      </w:r>
+      <w:r>
+        <w:t xml:space="preserve"> </w:t>
+      </w:r>
+      <w:r>
+        <w:t xml:space="preserve">ainda caem no mesmo grupo — falta parsear</w:t>
+      </w:r>
+      <w:r>
+        <w:t xml:space="preserve"> </w:t>
+      </w:r>
+      <w:r>
+        <w:t xml:space="preserve">a dosagem da descrição.</w:t>
       </w:r>
     </w:p>
     <w:p>
@@ -9491,22 +9827,34 @@
           <w:bCs/>
           <w:b/>
         </w:rPr>
-        <w:t xml:space="preserve">CadÚnico</w:t>
-      </w:r>
-      <w:r>
-        <w:t xml:space="preserve">: a taxa de extrema pobreza usa a competência de dezembro de cada</w:t>
-      </w:r>
-      <w:r>
-        <w:t xml:space="preserve"> </w:t>
-      </w:r>
-      <w:r>
-        <w:t xml:space="preserve">ano; a base do CadÚnico tem defasagem de atualização cadastral que varia</w:t>
-      </w:r>
-      <w:r>
-        <w:t xml:space="preserve"> </w:t>
-      </w:r>
-      <w:r>
-        <w:t xml:space="preserve">entre municípios.</w:t>
+        <w:t xml:space="preserve">Rank percentil dentro de PE</w:t>
+      </w:r>
+      <w:r>
+        <w:t xml:space="preserve"> </w:t>
+      </w:r>
+      <w:r>
+        <w:t xml:space="preserve">mede posição relativa, não suficiência</w:t>
+      </w:r>
+      <w:r>
+        <w:t xml:space="preserve"> </w:t>
+      </w:r>
+      <w:r>
+        <w:t xml:space="preserve">absoluta. Um estado inteiro subfinanciado teria municípios</w:t>
+      </w:r>
+      <w:r>
+        <w:t xml:space="preserve"> </w:t>
+      </w:r>
+      <w:r>
+        <w:t xml:space="preserve">“</w:t>
+      </w:r>
+      <w:r>
+        <w:t xml:space="preserve">azuis</w:t>
+      </w:r>
+      <w:r>
+        <w:t xml:space="preserve">”</w:t>
+      </w:r>
+      <w:r>
+        <w:t xml:space="preserve">.</w:t>
       </w:r>
     </w:p>
     <w:p>
@@ -9522,6 +9870,37 @@
           <w:bCs/>
           <w:b/>
         </w:rPr>
+        <w:t xml:space="preserve">CadÚnico</w:t>
+      </w:r>
+      <w:r>
+        <w:t xml:space="preserve">: a taxa de extrema pobreza usa a competência de dezembro de cada</w:t>
+      </w:r>
+      <w:r>
+        <w:t xml:space="preserve"> </w:t>
+      </w:r>
+      <w:r>
+        <w:t xml:space="preserve">ano; a base do CadÚnico tem defasagem de atualização cadastral que varia</w:t>
+      </w:r>
+      <w:r>
+        <w:t xml:space="preserve"> </w:t>
+      </w:r>
+      <w:r>
+        <w:t xml:space="preserve">entre municípios.</w:t>
+      </w:r>
+    </w:p>
+    <w:p>
+      <w:pPr>
+        <w:numPr>
+          <w:ilvl w:val="0"/>
+          <w:numId w:val="1008"/>
+        </w:numPr>
+        <w:pStyle w:val="Compact"/>
+      </w:pPr>
+      <w:r>
+        <w:rPr>
+          <w:bCs/>
+          <w:b/>
+        </w:rPr>
         <w:t xml:space="preserve">SIH ausente</w:t>
       </w:r>
       <w:r>
@@ -9544,8 +9923,8 @@
         </w:pict>
       </w:r>
     </w:p>
-    <w:bookmarkEnd w:id="50"/>
-    <w:bookmarkStart w:id="51" w:name="reprodutibilidade"/>
+    <w:bookmarkEnd w:id="51"/>
+    <w:bookmarkStart w:id="52" w:name="reprodutibilidade"/>
     <w:p>
       <w:pPr>
         <w:pStyle w:val="Heading1"/>
@@ -9712,7 +10091,7 @@
         <w:rPr>
           <w:rStyle w:val="CommentTok"/>
         </w:rPr>
-        <w:t xml:space="preserve"># 59 testes</w:t>
+        <w:t xml:space="preserve"># 64 testes</w:t>
       </w:r>
       <w:r>
         <w:br/>
@@ -9844,7 +10223,7 @@
         <w:t xml:space="preserve">Testes</w:t>
       </w:r>
       <w:r>
-        <w:t xml:space="preserve">: 59 no total — grão do gold (incluindo o join L2/vulnerabilidade),</w:t>
+        <w:t xml:space="preserve">: 64 no total — grão do gold, os quatro detectores com fixtures,</w:t>
       </w:r>
       <w:r>
         <w:t xml:space="preserve"> </w:t>
@@ -9909,8 +10288,8 @@
         </w:pict>
       </w:r>
     </w:p>
-    <w:bookmarkEnd w:id="51"/>
-    <w:bookmarkStart w:id="52" w:name="Xdbf186bb08ed647d33635f2a757b30d181d09dc"/>
+    <w:bookmarkEnd w:id="52"/>
+    <w:bookmarkStart w:id="53" w:name="Xdbf186bb08ed647d33635f2a757b30d181d09dc"/>
     <w:p>
       <w:pPr>
         <w:pStyle w:val="Heading1"/>
@@ -10101,8 +10480,8 @@
         </w:pict>
       </w:r>
     </w:p>
-    <w:bookmarkEnd w:id="52"/>
-    <w:bookmarkStart w:id="54" w:name="trabalhos-futuros"/>
+    <w:bookmarkEnd w:id="53"/>
+    <w:bookmarkStart w:id="55" w:name="trabalhos-futuros"/>
     <w:p>
       <w:pPr>
         <w:pStyle w:val="Heading1"/>
@@ -10116,19 +10495,25 @@
         <w:pStyle w:val="FirstParagraph"/>
       </w:pPr>
       <w:r>
-        <w:t xml:space="preserve">Entre a v1.0 e a v1.1, três fontes que constavam como bloqueadas foram</w:t>
-      </w:r>
-      <w:r>
-        <w:t xml:space="preserve"> </w:t>
-      </w:r>
-      <w:r>
-        <w:t xml:space="preserve">destravadas — SIOPS (L2), CadÚnico (vulnerabilidade) e o recurso de item do</w:t>
-      </w:r>
-      <w:r>
-        <w:t xml:space="preserve"> </w:t>
-      </w:r>
-      <w:r>
-        <w:t xml:space="preserve">PNCP (detector 3) —, o que deu cor ao farol. O que resta:</w:t>
+        <w:t xml:space="preserve">Da v1.0 à v1.2, todas as fontes do plano foram destravadas — SIOPS (L2),</w:t>
+      </w:r>
+      <w:r>
+        <w:t xml:space="preserve"> </w:t>
+      </w:r>
+      <w:r>
+        <w:t xml:space="preserve">CadÚnico (vulnerabilidade), Censo 2022 (saneamento), Portal da Transparência</w:t>
+      </w:r>
+      <w:r>
+        <w:t xml:space="preserve"> </w:t>
+      </w:r>
+      <w:r>
+        <w:t xml:space="preserve">(L1 parcial), preço por item do PNCP (detector 3) — e os quatro detectores</w:t>
+      </w:r>
+      <w:r>
+        <w:t xml:space="preserve"> </w:t>
+      </w:r>
+      <w:r>
+        <w:t xml:space="preserve">estão ativos. O que resta:</w:t>
       </w:r>
     </w:p>
     <w:p>
@@ -10144,113 +10529,46 @@
           <w:bCs/>
           <w:b/>
         </w:rPr>
-        <w:t xml:space="preserve">Portal da Transparência — L1.</w:t>
-      </w:r>
-      <w:r>
-        <w:t xml:space="preserve"> </w:t>
-      </w:r>
-      <w:r>
-        <w:t xml:space="preserve">O endpoint</w:t>
-      </w:r>
-      <w:r>
-        <w:t xml:space="preserve"> </w:t>
-      </w:r>
-      <w:r>
-        <w:rPr>
-          <w:rStyle w:val="VerbatimChar"/>
-        </w:rPr>
-        <w:t xml:space="preserve">/transferencias</w:t>
-      </w:r>
-      <w:r>
-        <w:t xml:space="preserve"> </w:t>
-      </w:r>
-      <w:r>
-        <w:t xml:space="preserve">exige nível de</w:t>
-      </w:r>
-      <w:r>
-        <w:t xml:space="preserve"> </w:t>
-      </w:r>
-      <w:r>
-        <w:t xml:space="preserve">acesso gov.br elevado (HTTP 403). A chave gratuita já</w:t>
-      </w:r>
-      <w:r>
-        <w:t xml:space="preserve"> </w:t>
-      </w:r>
-      <w:r>
-        <w:rPr>
-          <w:bCs/>
-          <w:b/>
-        </w:rPr>
-        <w:t xml:space="preserve">funciona</w:t>
-      </w:r>
-      <w:r>
-        <w:t xml:space="preserve"> </w:t>
-      </w:r>
-      <w:r>
-        <w:t xml:space="preserve">para</w:t>
-      </w:r>
-      <w:r>
-        <w:t xml:space="preserve"> </w:t>
-      </w:r>
-      <w:r>
-        <w:rPr>
-          <w:rStyle w:val="VerbatimChar"/>
-        </w:rPr>
-        <w:t xml:space="preserve">bolsa-familia-por-municipio</w:t>
-      </w:r>
-      <w:r>
-        <w:t xml:space="preserve">,</w:t>
-      </w:r>
-      <w:r>
-        <w:t xml:space="preserve"> </w:t>
-      </w:r>
-      <w:r>
-        <w:rPr>
-          <w:rStyle w:val="VerbatimChar"/>
-        </w:rPr>
-        <w:t xml:space="preserve">auxilio-emergencial-por-municipio</w:t>
-      </w:r>
-      <w:r>
-        <w:t xml:space="preserve"> </w:t>
-      </w:r>
-      <w:r>
-        <w:t xml:space="preserve">e</w:t>
-      </w:r>
-      <w:r>
-        <w:t xml:space="preserve"> </w:t>
-      </w:r>
-      <w:r>
-        <w:rPr>
-          <w:rStyle w:val="VerbatimChar"/>
-        </w:rPr>
-        <w:t xml:space="preserve">convenios</w:t>
-      </w:r>
-      <w:r>
-        <w:t xml:space="preserve"> </w:t>
-      </w:r>
-      <w:r>
-        <w:t xml:space="preserve">(todos com</w:t>
-      </w:r>
-      <w:r>
-        <w:t xml:space="preserve"> </w:t>
-      </w:r>
-      <w:r>
-        <w:rPr>
-          <w:rStyle w:val="VerbatimChar"/>
-        </w:rPr>
-        <w:t xml:space="preserve">codigoIbge</w:t>
-      </w:r>
-      <w:r>
-        <w:t xml:space="preserve"> </w:t>
-      </w:r>
-      <w:r>
-        <w:t xml:space="preserve">→ HTTP 200); dá para montar um L1 parcial</w:t>
-      </w:r>
-      <w:r>
-        <w:t xml:space="preserve"> </w:t>
-      </w:r>
-      <w:r>
-        <w:t xml:space="preserve">com esses e fechar o eixo Alocação em 3 de 3 camadas.</w:t>
+        <w:t xml:space="preserve">Completar o L1.</w:t>
+      </w:r>
+      <w:r>
+        <w:t xml:space="preserve"> </w:t>
+      </w:r>
+      <w:r>
+        <w:t xml:space="preserve">42 de 185 municípios coletados antes de a chave da</w:t>
+      </w:r>
+      <w:r>
+        <w:t xml:space="preserve"> </w:t>
+      </w:r>
+      <w:r>
+        <w:t xml:space="preserve">Transparência ser bloqueada por volume.</w:t>
+      </w:r>
+      <w:r>
+        <w:t xml:space="preserve"> </w:t>
+      </w:r>
+      <w:r>
+        <w:rPr>
+          <w:rStyle w:val="VerbatimChar"/>
+        </w:rPr>
+        <w:t xml:space="preserve">farol ingest-l1</w:t>
+      </w:r>
+      <w:r>
+        <w:t xml:space="preserve"> </w:t>
+      </w:r>
+      <w:r>
+        <w:t xml:space="preserve">retoma de onde</w:t>
+      </w:r>
+      <w:r>
+        <w:t xml:space="preserve"> </w:t>
+      </w:r>
+      <w:r>
+        <w:t xml:space="preserve">parou (pausa de 1,5 s/chamada, ~40 min para o resto). Isso fecha o eixo</w:t>
+      </w:r>
+      <w:r>
+        <w:t xml:space="preserve"> </w:t>
+      </w:r>
+      <w:r>
+        <w:t xml:space="preserve">Alocação em 3 de 3 para o estado inteiro e dá base ao detector 2.</w:t>
       </w:r>
     </w:p>
     <w:p>
@@ -10266,76 +10584,19 @@
           <w:bCs/>
           <w:b/>
         </w:rPr>
-        <w:t xml:space="preserve">Saneamento (substituto do SNIS).</w:t>
-      </w:r>
-      <w:r>
-        <w:t xml:space="preserve"> </w:t>
-      </w:r>
-      <w:r>
-        <w:t xml:space="preserve">O SNIS foi encerrado em 2023 (sucessor</w:t>
-      </w:r>
-      <w:r>
-        <w:t xml:space="preserve"> </w:t>
-      </w:r>
-      <w:r>
-        <w:t xml:space="preserve">SINISA, sem série histórica municipal) e o domínio da série histórica não</w:t>
-      </w:r>
-      <w:r>
-        <w:t xml:space="preserve"> </w:t>
-      </w:r>
-      <w:r>
-        <w:t xml:space="preserve">resolve. Substituir o subíndice pelos dados de</w:t>
-      </w:r>
-      <w:r>
-        <w:t xml:space="preserve"> </w:t>
-      </w:r>
-      <w:r>
-        <w:rPr>
-          <w:bCs/>
-          <w:b/>
-        </w:rPr>
-        <w:t xml:space="preserve">abastecimento de água /</w:t>
-      </w:r>
-      <w:r>
-        <w:rPr>
-          <w:bCs/>
-          <w:b/>
-        </w:rPr>
-        <w:t xml:space="preserve"> </w:t>
-      </w:r>
-      <w:r>
-        <w:rPr>
-          <w:bCs/>
-          <w:b/>
-        </w:rPr>
-        <w:t xml:space="preserve">esgoto / lixo do Censo 2022 do IBGE</w:t>
-      </w:r>
-      <w:r>
-        <w:t xml:space="preserve"> </w:t>
-      </w:r>
-      <w:r>
-        <w:t xml:space="preserve">— mesma família de fonte já ingerida,</w:t>
-      </w:r>
-      <w:r>
-        <w:t xml:space="preserve"> </w:t>
-      </w:r>
-      <w:r>
-        <w:t xml:space="preserve">catalogada no</w:t>
-      </w:r>
-      <w:r>
-        <w:t xml:space="preserve"> </w:t>
-      </w:r>
-      <w:r>
-        <w:rPr>
-          <w:rStyle w:val="VerbatimChar"/>
-        </w:rPr>
-        <w:t xml:space="preserve">dados.gov.br</w:t>
-      </w:r>
-      <w:r>
-        <w:t xml:space="preserve"> </w:t>
-      </w:r>
-      <w:r>
-        <w:t xml:space="preserve">—, o que fecha o eixo Necessidade em 3 de 3.</w:t>
+        <w:t xml:space="preserve">Dose no detector 3.</w:t>
+      </w:r>
+      <w:r>
+        <w:t xml:space="preserve"> </w:t>
+      </w:r>
+      <w:r>
+        <w:t xml:space="preserve">Parsear a dosagem (mg, ml) da descrição do item para</w:t>
+      </w:r>
+      <w:r>
+        <w:t xml:space="preserve"> </w:t>
+      </w:r>
+      <w:r>
+        <w:t xml:space="preserve">comparar preços de fato equivalentes.</w:t>
       </w:r>
     </w:p>
     <w:p>
@@ -10351,34 +10612,19 @@
           <w:bCs/>
           <w:b/>
         </w:rPr>
-        <w:t xml:space="preserve">Detector 3 — normalização por unidade.</w:t>
-      </w:r>
-      <w:r>
-        <w:t xml:space="preserve"> </w:t>
-      </w:r>
-      <w:r>
-        <w:t xml:space="preserve">Comparar preço unitário só entre</w:t>
-      </w:r>
-      <w:r>
-        <w:t xml:space="preserve"> </w:t>
-      </w:r>
-      <w:r>
-        <w:t xml:space="preserve">itens da mesma unidade de medida (ou converter mg/ml → dose), e rodar</w:t>
-      </w:r>
-      <w:r>
-        <w:t xml:space="preserve"> </w:t>
-      </w:r>
-      <w:r>
-        <w:rPr>
-          <w:rStyle w:val="VerbatimChar"/>
-        </w:rPr>
-        <w:t xml:space="preserve">farol ingest-itens</w:t>
-      </w:r>
-      <w:r>
-        <w:t xml:space="preserve"> </w:t>
-      </w:r>
-      <w:r>
-        <w:t xml:space="preserve">completo (hoje ~880 de ~1.400 contratos de saúde).</w:t>
+        <w:t xml:space="preserve">Compras.gov.br (L3 federal)</w:t>
+      </w:r>
+      <w:r>
+        <w:t xml:space="preserve"> </w:t>
+      </w:r>
+      <w:r>
+        <w:t xml:space="preserve">— complemento de escopo federal ao L3</w:t>
+      </w:r>
+      <w:r>
+        <w:t xml:space="preserve"> </w:t>
+      </w:r>
+      <w:r>
+        <w:t xml:space="preserve">municipal do PNCP; endpoint já validado no spike.</w:t>
       </w:r>
     </w:p>
     <w:p>
@@ -10394,52 +10640,18 @@
           <w:bCs/>
           <w:b/>
         </w:rPr>
-        <w:t xml:space="preserve">Detector 2 (resíduo de regressão)</w:t>
-      </w:r>
-      <w:r>
-        <w:t xml:space="preserve"> </w:t>
-      </w:r>
-      <w:r>
-        <w:t xml:space="preserve">passa a ser viável quando L1 entrar e o</w:t>
-      </w:r>
-      <w:r>
-        <w:t xml:space="preserve"> </w:t>
-      </w:r>
-      <w:r>
-        <w:t xml:space="preserve">eixo Alocação ficar completo.</w:t>
-      </w:r>
-    </w:p>
-    <w:p>
-      <w:pPr>
-        <w:numPr>
-          <w:ilvl w:val="0"/>
-          <w:numId w:val="1011"/>
-        </w:numPr>
-        <w:pStyle w:val="Compact"/>
-      </w:pPr>
-      <w:r>
-        <w:rPr>
-          <w:bCs/>
-          <w:b/>
-        </w:rPr>
         <w:t xml:space="preserve">Deploy do painel</w:t>
       </w:r>
       <w:r>
         <w:t xml:space="preserve"> </w:t>
       </w:r>
       <w:r>
-        <w:t xml:space="preserve">— arquivos prontos no repositório; o push já foi feito</w:t>
-      </w:r>
-      <w:r>
-        <w:t xml:space="preserve"> </w:t>
-      </w:r>
-      <w:r>
-        <w:t xml:space="preserve">para</w:t>
-      </w:r>
-      <w:r>
-        <w:t xml:space="preserve"> </w:t>
-      </w:r>
-      <w:hyperlink r:id="rId53">
+        <w:t xml:space="preserve">— arquivos prontos; o push já foi feito para</w:t>
+      </w:r>
+      <w:r>
+        <w:t xml:space="preserve"> </w:t>
+      </w:r>
+      <w:hyperlink r:id="rId54">
         <w:r>
           <w:rPr>
             <w:rStyle w:val="Hyperlink"/>
@@ -10466,13 +10678,13 @@
         <w:t xml:space="preserve"> </w:t>
       </w:r>
       <w:r>
-        <w:t xml:space="preserve">no</w:t>
-      </w:r>
-      <w:r>
-        <w:t xml:space="preserve"> </w:t>
-      </w:r>
-      <w:r>
-        <w:t xml:space="preserve">Streamlit Community Cloud (conta do autor).</w:t>
+        <w:t xml:space="preserve">no Streamlit</w:t>
+      </w:r>
+      <w:r>
+        <w:t xml:space="preserve"> </w:t>
+      </w:r>
+      <w:r>
+        <w:t xml:space="preserve">Community Cloud (conta do autor).</w:t>
       </w:r>
     </w:p>
     <w:p>
@@ -10482,8 +10694,8 @@
         </w:pict>
       </w:r>
     </w:p>
-    <w:bookmarkEnd w:id="54"/>
-    <w:bookmarkStart w:id="55" w:name="referências-de-dados"/>
+    <w:bookmarkEnd w:id="55"/>
+    <w:bookmarkStart w:id="56" w:name="referências-de-dados"/>
     <w:p>
       <w:pPr>
         <w:pStyle w:val="Heading1"/>
@@ -10669,7 +10881,7 @@
         <w:t xml:space="preserve">público.</w:t>
       </w:r>
     </w:p>
-    <w:bookmarkEnd w:id="55"/>
+    <w:bookmarkEnd w:id="56"/>
     <w:sectPr/>
   </w:body>
 </w:document>

</xml_diff>

<commit_message>
Diagrama sem cores de farol nos subíndices; remove atribuição de ferramenta
- app/tema.py: os seis blocos de subíndice do diagrama deixam de usar as
  cores do semáforo (vermelho/amarelo/verde davam a impressão errada de que
  epidemiologia = ruim etc.). Eixo N em azul institucional, eixo A em verde
  petróleo — as cores do farol ficam só na legenda do semáforo, onde
  significam algo.
- Remove a linha de atribuicao de ferramenta do
  rodapé do painel (tema.rodape), do cabeçalho e rodapé do relatório
  (.md/.html), do README e do author do gerar-docx.sh; .docx regenerado.
</commit_message>
<xml_diff>
--- a/docs/relatorio-tecnico.docx
+++ b/docs/relatorio-tecnico.docx
@@ -130,44 +130,6 @@
       </w:r>
       <w:r>
         <w:t xml:space="preserve">Pernambuco</w:t>
-      </w:r>
-    </w:p>
-    <w:p>
-      <w:pPr>
-        <w:pStyle w:val="Author"/>
-      </w:pPr>
-      <w:r>
-        <w:t xml:space="preserve">Concebido</w:t>
-      </w:r>
-      <w:r>
-        <w:t xml:space="preserve"> </w:t>
-      </w:r>
-      <w:r>
-        <w:t xml:space="preserve">e</w:t>
-      </w:r>
-      <w:r>
-        <w:t xml:space="preserve"> </w:t>
-      </w:r>
-      <w:r>
-        <w:t xml:space="preserve">implementado</w:t>
-      </w:r>
-      <w:r>
-        <w:t xml:space="preserve"> </w:t>
-      </w:r>
-      <w:r>
-        <w:t xml:space="preserve">com</w:t>
-      </w:r>
-      <w:r>
-        <w:t xml:space="preserve"> </w:t>
-      </w:r>
-      <w:r>
-        <w:t xml:space="preserve">Claude</w:t>
-      </w:r>
-      <w:r>
-        <w:t xml:space="preserve"> </w:t>
-      </w:r>
-      <w:r>
-        <w:t xml:space="preserve">(Anthropic)</w:t>
       </w:r>
     </w:p>
     <w:p>

</xml_diff>

<commit_message>
Atualiza documentação e relatório para o estado v1.4 do painel
- relatorio-tecnico (.md/.html/.docx): §8/§9 "Camada de apresentação"
  reescrita — sistema de design, diagrama SVG do índice, página Metodologia
  com todas as fórmulas em st.latex e "da fonte ao indicador" por fonte,
  Fontes com variável bruta -> transformação. §4.1/§5.1: nota sobre saneamento
  ponderado na ingestão e vulnerabilidade como componente único. §11/§12:
  75 testes (era 70), ~6.100 linhas em src/ (era ~4.200), conf/ieas.yml sem
  chaves inertes, requisito de fonte = 13 conjuntos catalogados.
- README: 75 testes, narrativa do cinza atualizada (Fernando de Noronha),
  lista de docs inclui o .html.
- Remove docs/PRONTO_PARA_INTERFACE.md — handoff de 2026-08-25 superado por
  STATUS.md e pelo relatório técnico.
</commit_message>
<xml_diff>
--- a/docs/relatorio-tecnico.docx
+++ b/docs/relatorio-tecnico.docx
@@ -4700,13 +4700,100 @@
         <w:pStyle w:val="BodyText"/>
       </w:pPr>
       <w:r>
-        <w:t xml:space="preserve">O subíndice epidemiológico é, ele próprio, uma combinação ponderada de três</w:t>
-      </w:r>
-      <w:r>
-        <w:t xml:space="preserve"> </w:t>
-      </w:r>
-      <w:r>
-        <w:t xml:space="preserve">componentes, cada um um rank percentil dentro de PE:</w:t>
+        <w:t xml:space="preserve">O subíndice de</w:t>
+      </w:r>
+      <w:r>
+        <w:t xml:space="preserve"> </w:t>
+      </w:r>
+      <w:r>
+        <w:rPr>
+          <w:bCs/>
+          <w:b/>
+        </w:rPr>
+        <w:t xml:space="preserve">saneamento</w:t>
+      </w:r>
+      <w:r>
+        <w:t xml:space="preserve"> </w:t>
+      </w:r>
+      <w:r>
+        <w:t xml:space="preserve">é o rank percentil de um déficit ponderado —</w:t>
+      </w:r>
+      <w:r>
+        <w:t xml:space="preserve"> </w:t>
+      </w:r>
+      <w:r>
+        <w:rPr>
+          <w:rStyle w:val="VerbatimChar"/>
+        </w:rPr>
+        <w:t xml:space="preserve">0,35·déficit_água + 0,45·déficit_esgoto + 0,20·déficit_lixo</w:t>
+      </w:r>
+      <w:r>
+        <w:t xml:space="preserve">, com os pesos</w:t>
+      </w:r>
+      <w:r>
+        <w:t xml:space="preserve"> </w:t>
+      </w:r>
+      <w:r>
+        <w:t xml:space="preserve">aplicados uma única vez, na ingestão (</w:t>
+      </w:r>
+      <w:r>
+        <w:rPr>
+          <w:rStyle w:val="VerbatimChar"/>
+        </w:rPr>
+        <w:t xml:space="preserve">ingest/ibge_saneamento.py</w:t>
+      </w:r>
+      <w:r>
+        <w:t xml:space="preserve">). O de</w:t>
+      </w:r>
+      <w:r>
+        <w:t xml:space="preserve"> </w:t>
+      </w:r>
+      <w:r>
+        <w:rPr>
+          <w:bCs/>
+          <w:b/>
+        </w:rPr>
+        <w:t xml:space="preserve">vulnerabilidade</w:t>
+      </w:r>
+      <w:r>
+        <w:t xml:space="preserve"> </w:t>
+      </w:r>
+      <w:r>
+        <w:t xml:space="preserve">é um componente único: o rank percentil da taxa de famílias</w:t>
+      </w:r>
+      <w:r>
+        <w:t xml:space="preserve"> </w:t>
+      </w:r>
+      <w:r>
+        <w:t xml:space="preserve">em extrema pobreza (a fonte não expõe, no grão município-ano, outras dimensões</w:t>
+      </w:r>
+      <w:r>
+        <w:t xml:space="preserve"> </w:t>
+      </w:r>
+      <w:r>
+        <w:t xml:space="preserve">comparáveis na série 2020–2024). O</w:t>
+      </w:r>
+      <w:r>
+        <w:t xml:space="preserve"> </w:t>
+      </w:r>
+      <w:r>
+        <w:rPr>
+          <w:bCs/>
+          <w:b/>
+        </w:rPr>
+        <w:t xml:space="preserve">epidemiológico</w:t>
+      </w:r>
+      <w:r>
+        <w:t xml:space="preserve"> </w:t>
+      </w:r>
+      <w:r>
+        <w:t xml:space="preserve">é, ele próprio, uma</w:t>
+      </w:r>
+      <w:r>
+        <w:t xml:space="preserve"> </w:t>
+      </w:r>
+      <w:r>
+        <w:t xml:space="preserve">combinação ponderada de três componentes, cada um um rank percentil dentro de PE:</w:t>
       </w:r>
       <w:r>
         <w:t xml:space="preserve"> </w:t>
@@ -7894,7 +7981,7 @@
         <w:pStyle w:val="FirstParagraph"/>
       </w:pPr>
       <w:r>
-        <w:t xml:space="preserve">Identidade institucional própria (</w:t>
+        <w:t xml:space="preserve">Sistema de design institucional próprio (</w:t>
       </w:r>
       <w:r>
         <w:rPr>
@@ -7903,13 +7990,29 @@
         <w:t xml:space="preserve">app/tema.py</w:t>
       </w:r>
       <w:r>
-        <w:t xml:space="preserve">: cabeçalho, rodapé, cartões e</w:t>
-      </w:r>
-      <w:r>
-        <w:t xml:space="preserve"> </w:t>
-      </w:r>
-      <w:r>
-        <w:t xml:space="preserve">CSS compartilhados; azul</w:t>
+        <w:t xml:space="preserve">: cabeçalho, rodapé,</w:t>
+      </w:r>
+      <w:r>
+        <w:t xml:space="preserve"> </w:t>
+      </w:r>
+      <w:r>
+        <w:t xml:space="preserve">cartões de indicador, notas/</w:t>
+      </w:r>
+      <w:r>
+        <w:rPr>
+          <w:iCs/>
+          <w:i/>
+        </w:rPr>
+        <w:t xml:space="preserve">callouts</w:t>
+      </w:r>
+      <w:r>
+        <w:t xml:space="preserve">, molduras de fórmula e CSS</w:t>
+      </w:r>
+      <w:r>
+        <w:t xml:space="preserve"> </w:t>
+      </w:r>
+      <w:r>
+        <w:t xml:space="preserve">compartilhados; azul</w:t>
       </w:r>
       <w:r>
         <w:t xml:space="preserve"> </w:t>
@@ -7921,7 +8024,71 @@
         <w:t xml:space="preserve">#1257a8</w:t>
       </w:r>
       <w:r>
-        <w:t xml:space="preserve">, o mesmo deste relatório). Home mais seis</w:t>
+        <w:t xml:space="preserve">, o mesmo deste relatório). O módulo também</w:t>
+      </w:r>
+      <w:r>
+        <w:t xml:space="preserve"> </w:t>
+      </w:r>
+      <w:r>
+        <w:t xml:space="preserve">desenha, em SVG puro, um</w:t>
+      </w:r>
+      <w:r>
+        <w:t xml:space="preserve"> </w:t>
+      </w:r>
+      <w:r>
+        <w:rPr>
+          <w:bCs/>
+          <w:b/>
+        </w:rPr>
+        <w:t xml:space="preserve">diagrama de construção do índice</w:t>
+      </w:r>
+      <w:r>
+        <w:t xml:space="preserve"> </w:t>
+      </w:r>
+      <w:r>
+        <w:t xml:space="preserve">— das oito fontes</w:t>
+      </w:r>
+      <w:r>
+        <w:t xml:space="preserve"> </w:t>
+      </w:r>
+      <w:r>
+        <w:t xml:space="preserve">aos dois eixos ponderados, ao rank percentil, ao</w:t>
+      </w:r>
+      <w:r>
+        <w:t xml:space="preserve"> </w:t>
+      </w:r>
+      <w:r>
+        <w:rPr>
+          <w:rStyle w:val="VerbatimChar"/>
+        </w:rPr>
+        <w:t xml:space="preserve">gap</w:t>
+      </w:r>
+      <w:r>
+        <w:t xml:space="preserve"> </w:t>
+      </w:r>
+      <w:r>
+        <w:t xml:space="preserve">e ao semáforo — com os</w:t>
+      </w:r>
+      <w:r>
+        <w:t xml:space="preserve"> </w:t>
+      </w:r>
+      <w:r>
+        <w:t xml:space="preserve">pesos lidos de</w:t>
+      </w:r>
+      <w:r>
+        <w:t xml:space="preserve"> </w:t>
+      </w:r>
+      <w:r>
+        <w:rPr>
+          <w:rStyle w:val="VerbatimChar"/>
+        </w:rPr>
+        <w:t xml:space="preserve">conf/ieas.yml</w:t>
+      </w:r>
+      <w:r>
+        <w:t xml:space="preserve"> </w:t>
+      </w:r>
+      <w:r>
+        <w:t xml:space="preserve">para nunca divergir do cálculo. Home mais seis</w:t>
       </w:r>
       <w:r>
         <w:t xml:space="preserve"> </w:t>
@@ -7942,13 +8109,13 @@
         <w:t xml:space="preserve"> </w:t>
       </w:r>
       <w:r>
-        <w:t xml:space="preserve">(cacheado); o texto</w:t>
-      </w:r>
-      <w:r>
-        <w:t xml:space="preserve"> </w:t>
-      </w:r>
-      <w:r>
-        <w:t xml:space="preserve">longo e o catálogo curado de fontes vivem em</w:t>
+        <w:t xml:space="preserve">(cacheado); a redação</w:t>
+      </w:r>
+      <w:r>
+        <w:t xml:space="preserve"> </w:t>
+      </w:r>
+      <w:r>
+        <w:t xml:space="preserve">institucional, o catálogo curado de fontes e o catálogo de fórmulas vivem em</w:t>
       </w:r>
       <w:r>
         <w:t xml:space="preserve"> </w:t>
@@ -8028,7 +8195,7 @@
               <w:jc w:val="left"/>
             </w:pPr>
             <w:r>
-              <w:t xml:space="preserve">o que o índice mede e para quem, como se lê o IEAS, o semáforo com a leitura de cada cor, as oito fontes com selo de estado e data da última coleta</w:t>
+              <w:t xml:space="preserve">o que o índice mede e para quem, como se lê o IEAS, o diagrama de construção, o semáforo com a leitura de cada cor, as oito fontes com selo de estado e data da última coleta</w:t>
             </w:r>
           </w:p>
         </w:tc>
@@ -8155,7 +8322,20 @@
               <w:jc w:val="left"/>
             </w:pPr>
             <w:r>
-              <w:t xml:space="preserve">catálogo curado das oito fontes — papel no IEAS, cobertura real, limitações — cruzado com a proveniência de</w:t>
+              <w:t xml:space="preserve">catálogo curado das oito fontes — papel no IEAS,</w:t>
+            </w:r>
+            <w:r>
+              <w:t xml:space="preserve"> </w:t>
+            </w:r>
+            <w:r>
+              <w:rPr>
+                <w:bCs/>
+                <w:b/>
+              </w:rPr>
+              <w:t xml:space="preserve">variável bruta → transformação até a coluna do gold</w:t>
+            </w:r>
+            <w:r>
+              <w:t xml:space="preserve">, cobertura real, limitações — cruzado com a proveniência de</w:t>
             </w:r>
             <w:r>
               <w:t xml:space="preserve"> </w:t>
@@ -8194,7 +8374,53 @@
               <w:jc w:val="left"/>
             </w:pPr>
             <w:r>
-              <w:t xml:space="preserve">fórmula do IEAS lida de</w:t>
+              <w:t xml:space="preserve">da fonte ao indicador (uma ficha por fonte);</w:t>
+            </w:r>
+            <w:r>
+              <w:t xml:space="preserve"> </w:t>
+            </w:r>
+            <w:r>
+              <w:rPr>
+                <w:bCs/>
+                <w:b/>
+              </w:rPr>
+              <w:t xml:space="preserve">todas as fórmulas em notação matemática</w:t>
+            </w:r>
+            <w:r>
+              <w:t xml:space="preserve"> </w:t>
+            </w:r>
+            <w:r>
+              <w:t xml:space="preserve">(</w:t>
+            </w:r>
+            <w:r>
+              <w:rPr>
+                <w:rStyle w:val="VerbatimChar"/>
+              </w:rPr>
+              <w:t xml:space="preserve">st.latex</w:t>
+            </w:r>
+            <w:r>
+              <w:t xml:space="preserve">/KaTeX) — taxa, deflator, rank percentil, média ponderada, os três subíndices, os dois eixos,</w:t>
+            </w:r>
+            <w:r>
+              <w:t xml:space="preserve"> </w:t>
+            </w:r>
+            <w:r>
+              <w:rPr>
+                <w:rStyle w:val="VerbatimChar"/>
+              </w:rPr>
+              <w:t xml:space="preserve">gap</w:t>
+            </w:r>
+            <w:r>
+              <w:t xml:space="preserve">/</w:t>
+            </w:r>
+            <w:r>
+              <w:rPr>
+                <w:rStyle w:val="VerbatimChar"/>
+              </w:rPr>
+              <w:t xml:space="preserve">ieas</w:t>
+            </w:r>
+            <w:r>
+              <w:t xml:space="preserve">, os quatro detectores — com os parâmetros interpolados de</w:t>
             </w:r>
             <w:r>
               <w:t xml:space="preserve"> </w:t>
@@ -8206,7 +8432,7 @@
               <w:t xml:space="preserve">conf/ieas.yml</w:t>
             </w:r>
             <w:r>
-              <w:t xml:space="preserve">, regra do cinza, decisões metodológicas que mudam o resultado, tabela de proveniência com link para o</w:t>
+              <w:t xml:space="preserve">; regra do cinza; decisões metodológicas; tabela de proveniência com link para o</w:t>
             </w:r>
             <w:r>
               <w:t xml:space="preserve"> </w:t>
@@ -11473,7 +11699,7 @@
         <w:rPr>
           <w:rStyle w:val="CommentTok"/>
         </w:rPr>
-        <w:t xml:space="preserve"># 70 testes</w:t>
+        <w:t xml:space="preserve"># 75 testes</w:t>
       </w:r>
       <w:r>
         <w:br/>
@@ -11642,7 +11868,22 @@
         <w:t xml:space="preserve">conf/ieas.yml</w:t>
       </w:r>
       <w:r>
-        <w:t xml:space="preserve">.</w:t>
+        <w:t xml:space="preserve"> </w:t>
+      </w:r>
+      <w:r>
+        <w:t xml:space="preserve">—</w:t>
+      </w:r>
+      <w:r>
+        <w:t xml:space="preserve"> </w:t>
+      </w:r>
+      <w:r>
+        <w:t xml:space="preserve">e todo parâmetro do arquivo é de fato lido pelo código (as chaves inertes</w:t>
+      </w:r>
+      <w:r>
+        <w:t xml:space="preserve"> </w:t>
+      </w:r>
+      <w:r>
+        <w:t xml:space="preserve">herdadas do plano original foram removidas).</w:t>
       </w:r>
     </w:p>
     <w:p>
@@ -11661,7 +11902,7 @@
         <w:t xml:space="preserve">Testes</w:t>
       </w:r>
       <w:r>
-        <w:t xml:space="preserve">: 70 no total — grão do gold, os quatro detectores com fixtures,</w:t>
+        <w:t xml:space="preserve">: 75 no total — grão do gold, os quatro detectores com fixtures,</w:t>
       </w:r>
       <w:r>
         <w:t xml:space="preserve"> </w:t>
@@ -11685,7 +11926,19 @@
         <w:t xml:space="preserve"> </w:t>
       </w:r>
       <w:r>
-        <w:t xml:space="preserve">da API.</w:t>
+        <w:t xml:space="preserve">da API (serialização de</w:t>
+      </w:r>
+      <w:r>
+        <w:t xml:space="preserve"> </w:t>
+      </w:r>
+      <w:r>
+        <w:rPr>
+          <w:rStyle w:val="VerbatimChar"/>
+        </w:rPr>
+        <w:t xml:space="preserve">NaN</w:t>
+      </w:r>
+      <w:r>
+        <w:t xml:space="preserve">).</w:t>
       </w:r>
     </w:p>
     <w:p>
@@ -11704,7 +11957,7 @@
         <w:t xml:space="preserve">Tamanho</w:t>
       </w:r>
       <w:r>
-        <w:t xml:space="preserve">: ~4.200 linhas de Python em</w:t>
+        <w:t xml:space="preserve">: ~6.100 linhas de Python em</w:t>
       </w:r>
       <w:r>
         <w:t xml:space="preserve"> </w:t>
@@ -11716,7 +11969,7 @@
         <w:t xml:space="preserve">src/</w:t>
       </w:r>
       <w:r>
-        <w:t xml:space="preserve">, ~900 em</w:t>
+        <w:t xml:space="preserve">, ~970 em</w:t>
       </w:r>
       <w:r>
         <w:t xml:space="preserve"> </w:t>
@@ -11785,13 +12038,31 @@
         <w:t xml:space="preserve"> </w:t>
       </w:r>
       <w:r>
-        <w:t xml:space="preserve">com sobra — IBGE, SINAN, SIH, PNCP, SIOPS, CadÚnico e o Portal da</w:t>
-      </w:r>
-      <w:r>
-        <w:t xml:space="preserve"> </w:t>
-      </w:r>
-      <w:r>
-        <w:t xml:space="preserve">Transparência da própria CGU.</w:t>
+        <w:t xml:space="preserve">com sobra — o reúso referencia treze conjuntos catalogados (as três</w:t>
+      </w:r>
+      <w:r>
+        <w:t xml:space="preserve"> </w:t>
+      </w:r>
+      <w:r>
+        <w:t xml:space="preserve">arboviroses do SINAN, SIH, Censo 2022, CadÚnico, SIOPS, PNCP, Compras.gov.br,</w:t>
+      </w:r>
+      <w:r>
+        <w:t xml:space="preserve"> </w:t>
+      </w:r>
+      <w:r>
+        <w:t xml:space="preserve">Portal da Transparência da própria CGU, Estimativas de População, IPCA e a</w:t>
+      </w:r>
+      <w:r>
+        <w:t xml:space="preserve"> </w:t>
+      </w:r>
+      <w:r>
+        <w:t xml:space="preserve">Malha Municipal). Leptospirose, hepatite A e esquistossomose do SINAN entram</w:t>
+      </w:r>
+      <w:r>
+        <w:t xml:space="preserve"> </w:t>
+      </w:r>
+      <w:r>
+        <w:t xml:space="preserve">como não catalogados (acessados via PySUS).</w:t>
       </w:r>
     </w:p>
     <w:p>
@@ -11810,19 +12081,25 @@
         <w:t xml:space="preserve">Múltiplas fontes</w:t>
       </w:r>
       <w:r>
-        <w:t xml:space="preserve">: o produto cruza epidemiologia (SINAN + SIH),</w:t>
-      </w:r>
-      <w:r>
-        <w:t xml:space="preserve"> </w:t>
-      </w:r>
-      <w:r>
-        <w:t xml:space="preserve">vulnerabilidade (CadÚnico), execução orçamentária (SIOPS), contratações</w:t>
-      </w:r>
-      <w:r>
-        <w:t xml:space="preserve"> </w:t>
-      </w:r>
-      <w:r>
-        <w:t xml:space="preserve">(PNCP + Compras.gov.br) e demografia (IBGE) num grão único.</w:t>
+        <w:t xml:space="preserve">: o produto cruza epidemiologia (SINAN + SIH), déficit de</w:t>
+      </w:r>
+      <w:r>
+        <w:t xml:space="preserve"> </w:t>
+      </w:r>
+      <w:r>
+        <w:t xml:space="preserve">saneamento (Censo 2022), vulnerabilidade (CadÚnico), execução orçamentária</w:t>
+      </w:r>
+      <w:r>
+        <w:t xml:space="preserve"> </w:t>
+      </w:r>
+      <w:r>
+        <w:t xml:space="preserve">(SIOPS), contratações (PNCP + Compras.gov.br), repasse federal (Portal da</w:t>
+      </w:r>
+      <w:r>
+        <w:t xml:space="preserve"> </w:t>
+      </w:r>
+      <w:r>
+        <w:t xml:space="preserve">Transparência) e demografia (IBGE) num grão único.</w:t>
       </w:r>
     </w:p>
     <w:p>

</xml_diff>